<commit_message>
fix: resolve OpenXML schema corruption, fix table parentheses RTL direction, and correctly embed figure 4-1
</commit_message>
<xml_diff>
--- a/output/final/thesis_complete_draft_v2.docx
+++ b/output/final/thesis_complete_draft_v2.docx
@@ -1,6 +1,6 @@
 
 <file path=word/document.xml><?xml version="1.0" encoding="utf-8"?>
-<w:document xmlns:ns1="http://schemas.openxmlformats.org/markup-compatibility/2006" xmlns:r="http://schemas.openxmlformats.org/officeDocument/2006/relationships" xmlns:w="http://schemas.openxmlformats.org/wordprocessingml/2006/main" ns1:Ignorable="w14 wp14">
+<w:document xmlns:mc="http://schemas.openxmlformats.org/markup-compatibility/2006" xmlns:r="http://schemas.openxmlformats.org/officeDocument/2006/relationships" xmlns:w="http://schemas.openxmlformats.org/wordprocessingml/2006/main" mc:Ignorable="w14 wp14">
   <w:body>
     <w:p/>
     <w:p/>
@@ -9,8 +9,8 @@
     <w:p>
       <w:pPr>
         <w:bidi/>
+        <w:spacing w:line="580" w:lineRule="exact"/>
         <w:jc w:val="center"/>
-        <w:spacing w:line="580" w:lineRule="exact"/>
       </w:pPr>
       <w:r>
         <w:rPr>
@@ -32,8 +32,8 @@
     <w:p>
       <w:pPr>
         <w:bidi/>
+        <w:spacing w:line="580" w:lineRule="exact"/>
         <w:jc w:val="center"/>
-        <w:spacing w:line="580" w:lineRule="exact"/>
       </w:pPr>
       <w:r>
         <w:rPr>
@@ -52,8 +52,8 @@
     <w:p>
       <w:pPr>
         <w:bidi/>
+        <w:spacing w:line="580" w:lineRule="exact"/>
         <w:jc w:val="center"/>
-        <w:spacing w:line="580" w:lineRule="exact"/>
       </w:pPr>
       <w:r>
         <w:rPr>
@@ -70,8 +70,8 @@
     <w:p>
       <w:pPr>
         <w:bidi/>
+        <w:spacing w:line="580" w:lineRule="exact"/>
         <w:jc w:val="center"/>
-        <w:spacing w:line="580" w:lineRule="exact"/>
       </w:pPr>
       <w:r>
         <w:rPr>
@@ -88,8 +88,8 @@
     <w:p>
       <w:pPr>
         <w:bidi/>
+        <w:spacing w:line="580" w:lineRule="exact"/>
         <w:jc w:val="center"/>
-        <w:spacing w:line="580" w:lineRule="exact"/>
       </w:pPr>
       <w:r>
         <w:rPr>
@@ -108,8 +108,8 @@
     <w:p>
       <w:pPr>
         <w:bidi/>
+        <w:spacing w:line="580" w:lineRule="exact"/>
         <w:jc w:val="center"/>
-        <w:spacing w:line="580" w:lineRule="exact"/>
       </w:pPr>
       <w:r>
         <w:rPr>
@@ -129,8 +129,8 @@
     <w:p>
       <w:pPr>
         <w:bidi/>
+        <w:spacing w:line="580" w:lineRule="exact"/>
         <w:jc w:val="center"/>
-        <w:spacing w:line="580" w:lineRule="exact"/>
       </w:pPr>
       <w:r>
         <w:rPr>
@@ -156,8 +156,8 @@
     <w:p>
       <w:pPr>
         <w:bidi/>
+        <w:spacing w:line="580" w:lineRule="exact"/>
         <w:jc w:val="center"/>
-        <w:spacing w:line="580" w:lineRule="exact"/>
       </w:pPr>
       <w:r>
         <w:rPr>
@@ -185,8 +185,8 @@
     <w:p>
       <w:pPr>
         <w:bidi/>
+        <w:spacing w:line="580" w:lineRule="exact"/>
         <w:jc w:val="center"/>
-        <w:spacing w:line="580" w:lineRule="exact"/>
       </w:pPr>
       <w:r>
         <w:rPr>
@@ -208,8 +208,8 @@
     <w:p>
       <w:pPr>
         <w:bidi/>
+        <w:spacing w:line="580" w:lineRule="exact"/>
         <w:jc w:val="center"/>
-        <w:spacing w:line="580" w:lineRule="exact"/>
       </w:pPr>
       <w:r>
         <w:rPr>
@@ -227,29 +227,29 @@
     <w:p>
       <w:pPr>
         <w:bidi/>
+        <w:spacing w:line="580" w:lineRule="exact"/>
         <w:jc w:val="center"/>
+      </w:pPr>
+      <w:r>
+        <w:rPr>
+          <w:rFonts w:ascii="B Nazanin" w:hAnsi="B Nazanin" w:cs="B Nazanin"/>
+          <w:sz w:val="24"/>
+          <w:szCs w:val="24"/>
+          <w:rtl/>
+        </w:rPr>
+        <w:t>[فرم تأییدیه و صورت‌جلسه دفاع پس از جلسه دفاع در این محل قرار می‌گیرد]</w:t>
+      </w:r>
+    </w:p>
+    <w:p>
+      <w:r>
+        <w:br w:type="page"/>
+      </w:r>
+    </w:p>
+    <w:p>
+      <w:pPr>
+        <w:bidi/>
         <w:spacing w:line="580" w:lineRule="exact"/>
-      </w:pPr>
-      <w:r>
-        <w:rPr>
-          <w:rFonts w:ascii="B Nazanin" w:hAnsi="B Nazanin" w:cs="B Nazanin"/>
-          <w:sz w:val="24"/>
-          <w:szCs w:val="24"/>
-          <w:rtl/>
-        </w:rPr>
-        <w:t>[فرم تأییدیه و صورت‌جلسه دفاع پس از جلسه دفاع در این محل قرار می‌گیرد]</w:t>
-      </w:r>
-    </w:p>
-    <w:p>
-      <w:r>
-        <w:br w:type="page"/>
-      </w:r>
-    </w:p>
-    <w:p>
-      <w:pPr>
-        <w:bidi/>
         <w:jc w:val="center"/>
-        <w:spacing w:line="580" w:lineRule="exact"/>
       </w:pPr>
       <w:r>
         <w:rPr>
@@ -267,29 +267,29 @@
     <w:p>
       <w:pPr>
         <w:bidi/>
+        <w:spacing w:line="580" w:lineRule="exact"/>
         <w:jc w:val="center"/>
+      </w:pPr>
+      <w:r>
+        <w:rPr>
+          <w:rFonts w:ascii="B Nazanin" w:hAnsi="B Nazanin" w:cs="B Nazanin"/>
+          <w:sz w:val="24"/>
+          <w:szCs w:val="24"/>
+          <w:rtl/>
+        </w:rPr>
+        <w:t>[فرم تعهدنامه اصالت اثر پس از تکمیل در این محل قرار می‌گیرد]</w:t>
+      </w:r>
+    </w:p>
+    <w:p>
+      <w:r>
+        <w:br w:type="page"/>
+      </w:r>
+    </w:p>
+    <w:p>
+      <w:pPr>
+        <w:bidi/>
         <w:spacing w:line="580" w:lineRule="exact"/>
-      </w:pPr>
-      <w:r>
-        <w:rPr>
-          <w:rFonts w:ascii="B Nazanin" w:hAnsi="B Nazanin" w:cs="B Nazanin"/>
-          <w:sz w:val="24"/>
-          <w:szCs w:val="24"/>
-          <w:rtl/>
-        </w:rPr>
-        <w:t>[فرم تعهدنامه اصالت اثر پس از تکمیل در این محل قرار می‌گیرد]</w:t>
-      </w:r>
-    </w:p>
-    <w:p>
-      <w:r>
-        <w:br w:type="page"/>
-      </w:r>
-    </w:p>
-    <w:p>
-      <w:pPr>
-        <w:bidi/>
         <w:jc w:val="center"/>
-        <w:spacing w:line="580" w:lineRule="exact"/>
       </w:pPr>
       <w:r>
         <w:rPr>
@@ -307,8 +307,8 @@
     <w:p>
       <w:pPr>
         <w:bidi/>
+        <w:spacing w:line="580" w:lineRule="exact"/>
         <w:jc w:val="center"/>
-        <w:spacing w:line="580" w:lineRule="exact"/>
       </w:pPr>
       <w:r>
         <w:rPr>
@@ -328,8 +328,8 @@
     <w:p>
       <w:pPr>
         <w:bidi/>
+        <w:spacing w:line="580" w:lineRule="exact"/>
         <w:jc w:val="center"/>
-        <w:spacing w:line="580" w:lineRule="exact"/>
       </w:pPr>
       <w:r>
         <w:rPr>
@@ -347,8 +347,8 @@
     <w:p>
       <w:pPr>
         <w:bidi/>
+        <w:spacing w:line="580" w:lineRule="exact"/>
         <w:jc w:val="both"/>
-        <w:spacing w:line="580" w:lineRule="exact"/>
       </w:pPr>
       <w:r>
         <w:rPr>
@@ -368,8 +368,8 @@
     <w:p>
       <w:pPr>
         <w:bidi/>
+        <w:spacing w:line="580" w:lineRule="exact"/>
         <w:jc w:val="center"/>
-        <w:spacing w:line="580" w:lineRule="exact"/>
       </w:pPr>
       <w:r>
         <w:rPr>
@@ -387,24 +387,24 @@
     <w:p>
       <w:pPr>
         <w:bidi/>
+        <w:spacing w:line="580" w:lineRule="exact"/>
         <w:jc w:val="both"/>
+      </w:pPr>
+      <w:r>
+        <w:rPr>
+          <w:rFonts w:ascii="B Nazanin" w:hAnsi="B Nazanin" w:cs="B Nazanin"/>
+          <w:sz w:val="24"/>
+          <w:szCs w:val="24"/>
+          <w:rtl/>
+        </w:rPr>
+        <w:t>پژوهش حاضر با هدف تعیین نقش میانجی‌گر طرحواره‌های ناسازگار اولیه در رابطه بین اضطراب صفتی و رفتارهای مالی پرخطر در معامله‌گران بازارهای مالی طراحی شد. این پژوهش از نظر هدف کاربردی و از نظر روش توصیفی-همبستگی از نوع مدل‌سازی معادلات ساختاری است. جامعهٔ آماری پژوهش را کلیهٔ معامله‌گران حقیقی فارسی‌زبان بالای ۱۸ سال با حداقل شش ماه سابقهٔ معامله تشکیل می‌دهند و نمونه‌گیری به روش غیرتصادفی در دسترس به همراه روش گلوله‌برفی انجام می‌شود؛ حجم نمونهٔ هدف بر اساس قواعد تجربی مدل‌یابی معادلات ساختاری ۲۰۰ نفر در نظر گرفته شد. ابزارهای پژوهش شامل فرم اضطراب صفتی پرسشنامهٔ حالت-صفت اسپیلبرگر (۲۰ گویه)، پرسشنامهٔ طرحواره‌های ناسازگار اولیهٔ یانگ ــ فرم کوتاه (۷۵ گویه) و مقیاس تحمل ریسک مالی گرابل و لایتون (۱۳ سؤال) است. برای تحلیل داده‌ها از آمار توصیفی، ضریب همبستگی پیرسون، مدل‌سازی معادلات ساختاری با شاخص‌های برازش و تحلیل میانجی‌گری با ماکروی PROCESS استفاده خواهد شد. یافته‌های تجربی نهایی پس از تحلیل داده‌های واقعی در نسخه نهایی پایان‌نامه گزارش خواهد شد.</w:t>
+      </w:r>
+    </w:p>
+    <w:p>
+      <w:pPr>
+        <w:bidi/>
         <w:spacing w:line="580" w:lineRule="exact"/>
-      </w:pPr>
-      <w:r>
-        <w:rPr>
-          <w:rFonts w:ascii="B Nazanin" w:hAnsi="B Nazanin" w:cs="B Nazanin"/>
-          <w:sz w:val="24"/>
-          <w:szCs w:val="24"/>
-          <w:rtl/>
-        </w:rPr>
-        <w:t>پژوهش حاضر با هدف تعیین نقش میانجی‌گر طرحواره‌های ناسازگار اولیه در رابطه بین اضطراب صفتی و رفتارهای مالی پرخطر در معامله‌گران بازارهای مالی طراحی شد. این پژوهش از نظر هدف کاربردی و از نظر روش توصیفی-همبستگی از نوع مدل‌سازی معادلات ساختاری است. جامعهٔ آماری پژوهش را کلیهٔ معامله‌گران حقیقی فارسی‌زبان بالای ۱۸ سال با حداقل شش ماه سابقهٔ معامله تشکیل می‌دهند و نمونه‌گیری به روش غیرتصادفی در دسترس به همراه روش گلوله‌برفی انجام می‌شود؛ حجم نمونهٔ هدف بر اساس قواعد تجربی مدل‌یابی معادلات ساختاری ۲۰۰ نفر در نظر گرفته شد. ابزارهای پژوهش شامل فرم اضطراب صفتی پرسشنامهٔ حالت-صفت اسپیلبرگر (۲۰ گویه)، پرسشنامهٔ طرحواره‌های ناسازگار اولیهٔ یانگ ــ فرم کوتاه (۷۵ گویه) و مقیاس تحمل ریسک مالی گرابل و لایتون (۱۳ سؤال) است. برای تحلیل داده‌ها از آمار توصیفی، ضریب همبستگی پیرسون، مدل‌سازی معادلات ساختاری با شاخص‌های برازش و تحلیل میانجی‌گری با ماکروی PROCESS استفاده خواهد شد. یافته‌های تجربی نهایی پس از تحلیل داده‌های واقعی در نسخه نهایی پایان‌نامه گزارش خواهد شد.</w:t>
-      </w:r>
-    </w:p>
-    <w:p>
-      <w:pPr>
-        <w:bidi/>
         <w:jc w:val="both"/>
-        <w:spacing w:line="580" w:lineRule="exact"/>
       </w:pPr>
       <w:r>
         <w:rPr>
@@ -437,7 +437,7 @@
         <w:sectPr>
           <w:footerReference w:type="default" r:id="rId20"/>
           <w:footnotePr>
-            <w:numFmt w:val="hindi"/>
+            <w:numFmt w:val="decimal"/>
             <w:numRestart w:val="eachPage"/>
           </w:footnotePr>
           <w:pgSz w:w="11906" w:h="16838"/>
@@ -451,8 +451,8 @@
     <w:p>
       <w:pPr>
         <w:bidi/>
+        <w:spacing w:line="580" w:lineRule="exact"/>
         <w:jc w:val="center"/>
-        <w:spacing w:line="580" w:lineRule="exact"/>
       </w:pPr>
       <w:r>
         <w:rPr>
@@ -493,8 +493,8 @@
       <w:pPr>
         <w:pStyle w:val="TOC1"/>
         <w:bidi/>
+        <w:spacing w:line="580" w:lineRule="exact"/>
         <w:jc w:val="right"/>
-        <w:spacing w:line="580" w:lineRule="exact"/>
       </w:pPr>
       <w:r>
         <w:rPr>
@@ -512,8 +512,8 @@
       <w:pPr>
         <w:pStyle w:val="TOC2"/>
         <w:bidi/>
+        <w:spacing w:line="580" w:lineRule="exact"/>
         <w:jc w:val="right"/>
-        <w:spacing w:line="580" w:lineRule="exact"/>
       </w:pPr>
       <w:r>
         <w:rPr>
@@ -529,8 +529,8 @@
       <w:pPr>
         <w:pStyle w:val="TOC2"/>
         <w:bidi/>
+        <w:spacing w:line="580" w:lineRule="exact"/>
         <w:jc w:val="right"/>
-        <w:spacing w:line="580" w:lineRule="exact"/>
       </w:pPr>
       <w:r>
         <w:rPr>
@@ -546,8 +546,8 @@
       <w:pPr>
         <w:pStyle w:val="TOC3"/>
         <w:bidi/>
+        <w:spacing w:line="580" w:lineRule="exact"/>
         <w:jc w:val="right"/>
-        <w:spacing w:line="580" w:lineRule="exact"/>
       </w:pPr>
       <w:r>
         <w:rPr>
@@ -563,8 +563,8 @@
       <w:pPr>
         <w:pStyle w:val="TOC3"/>
         <w:bidi/>
+        <w:spacing w:line="580" w:lineRule="exact"/>
         <w:jc w:val="right"/>
-        <w:spacing w:line="580" w:lineRule="exact"/>
       </w:pPr>
       <w:r>
         <w:rPr>
@@ -580,8 +580,8 @@
       <w:pPr>
         <w:pStyle w:val="TOC3"/>
         <w:bidi/>
+        <w:spacing w:line="580" w:lineRule="exact"/>
         <w:jc w:val="right"/>
-        <w:spacing w:line="580" w:lineRule="exact"/>
       </w:pPr>
       <w:r>
         <w:rPr>
@@ -597,8 +597,8 @@
       <w:pPr>
         <w:pStyle w:val="TOC3"/>
         <w:bidi/>
+        <w:spacing w:line="580" w:lineRule="exact"/>
         <w:jc w:val="right"/>
-        <w:spacing w:line="580" w:lineRule="exact"/>
       </w:pPr>
       <w:r>
         <w:rPr>
@@ -614,8 +614,8 @@
       <w:pPr>
         <w:pStyle w:val="TOC3"/>
         <w:bidi/>
+        <w:spacing w:line="580" w:lineRule="exact"/>
         <w:jc w:val="right"/>
-        <w:spacing w:line="580" w:lineRule="exact"/>
       </w:pPr>
       <w:r>
         <w:rPr>
@@ -631,8 +631,8 @@
       <w:pPr>
         <w:pStyle w:val="TOC2"/>
         <w:bidi/>
+        <w:spacing w:line="580" w:lineRule="exact"/>
         <w:jc w:val="right"/>
-        <w:spacing w:line="580" w:lineRule="exact"/>
       </w:pPr>
       <w:r>
         <w:rPr>
@@ -648,8 +648,8 @@
       <w:pPr>
         <w:pStyle w:val="TOC3"/>
         <w:bidi/>
+        <w:spacing w:line="580" w:lineRule="exact"/>
         <w:jc w:val="right"/>
-        <w:spacing w:line="580" w:lineRule="exact"/>
       </w:pPr>
       <w:r>
         <w:rPr>
@@ -665,8 +665,8 @@
       <w:pPr>
         <w:pStyle w:val="TOC3"/>
         <w:bidi/>
+        <w:spacing w:line="580" w:lineRule="exact"/>
         <w:jc w:val="right"/>
-        <w:spacing w:line="580" w:lineRule="exact"/>
       </w:pPr>
       <w:r>
         <w:rPr>
@@ -682,8 +682,8 @@
       <w:pPr>
         <w:pStyle w:val="TOC3"/>
         <w:bidi/>
+        <w:spacing w:line="580" w:lineRule="exact"/>
         <w:jc w:val="right"/>
-        <w:spacing w:line="580" w:lineRule="exact"/>
       </w:pPr>
       <w:r>
         <w:rPr>
@@ -699,8 +699,8 @@
       <w:pPr>
         <w:pStyle w:val="TOC3"/>
         <w:bidi/>
+        <w:spacing w:line="580" w:lineRule="exact"/>
         <w:jc w:val="right"/>
-        <w:spacing w:line="580" w:lineRule="exact"/>
       </w:pPr>
       <w:r>
         <w:rPr>
@@ -716,8 +716,8 @@
       <w:pPr>
         <w:pStyle w:val="TOC3"/>
         <w:bidi/>
+        <w:spacing w:line="580" w:lineRule="exact"/>
         <w:jc w:val="right"/>
-        <w:spacing w:line="580" w:lineRule="exact"/>
       </w:pPr>
       <w:r>
         <w:rPr>
@@ -733,8 +733,8 @@
       <w:pPr>
         <w:pStyle w:val="TOC2"/>
         <w:bidi/>
+        <w:spacing w:line="580" w:lineRule="exact"/>
         <w:jc w:val="right"/>
-        <w:spacing w:line="580" w:lineRule="exact"/>
       </w:pPr>
       <w:r>
         <w:rPr>
@@ -750,8 +750,8 @@
       <w:pPr>
         <w:pStyle w:val="TOC3"/>
         <w:bidi/>
+        <w:spacing w:line="580" w:lineRule="exact"/>
         <w:jc w:val="right"/>
-        <w:spacing w:line="580" w:lineRule="exact"/>
       </w:pPr>
       <w:r>
         <w:rPr>
@@ -767,8 +767,8 @@
       <w:pPr>
         <w:pStyle w:val="TOC3"/>
         <w:bidi/>
+        <w:spacing w:line="580" w:lineRule="exact"/>
         <w:jc w:val="right"/>
-        <w:spacing w:line="580" w:lineRule="exact"/>
       </w:pPr>
       <w:r>
         <w:rPr>
@@ -784,8 +784,8 @@
       <w:pPr>
         <w:pStyle w:val="TOC2"/>
         <w:bidi/>
+        <w:spacing w:line="580" w:lineRule="exact"/>
         <w:jc w:val="right"/>
-        <w:spacing w:line="580" w:lineRule="exact"/>
       </w:pPr>
       <w:r>
         <w:rPr>
@@ -801,8 +801,8 @@
       <w:pPr>
         <w:pStyle w:val="TOC2"/>
         <w:bidi/>
+        <w:spacing w:line="580" w:lineRule="exact"/>
         <w:jc w:val="right"/>
-        <w:spacing w:line="580" w:lineRule="exact"/>
       </w:pPr>
       <w:r>
         <w:rPr>
@@ -818,8 +818,8 @@
       <w:pPr>
         <w:pStyle w:val="TOC3"/>
         <w:bidi/>
+        <w:spacing w:line="580" w:lineRule="exact"/>
         <w:jc w:val="right"/>
-        <w:spacing w:line="580" w:lineRule="exact"/>
       </w:pPr>
       <w:r>
         <w:rPr>
@@ -835,8 +835,8 @@
       <w:pPr>
         <w:pStyle w:val="TOC3"/>
         <w:bidi/>
+        <w:spacing w:line="580" w:lineRule="exact"/>
         <w:jc w:val="right"/>
-        <w:spacing w:line="580" w:lineRule="exact"/>
       </w:pPr>
       <w:r>
         <w:rPr>
@@ -852,8 +852,8 @@
       <w:pPr>
         <w:pStyle w:val="TOC3"/>
         <w:bidi/>
+        <w:spacing w:line="580" w:lineRule="exact"/>
         <w:jc w:val="right"/>
-        <w:spacing w:line="580" w:lineRule="exact"/>
       </w:pPr>
       <w:r>
         <w:rPr>
@@ -869,8 +869,8 @@
       <w:pPr>
         <w:pStyle w:val="TOC2"/>
         <w:bidi/>
+        <w:spacing w:line="580" w:lineRule="exact"/>
         <w:jc w:val="right"/>
-        <w:spacing w:line="580" w:lineRule="exact"/>
       </w:pPr>
       <w:r>
         <w:rPr>
@@ -886,8 +886,8 @@
       <w:pPr>
         <w:pStyle w:val="TOC1"/>
         <w:bidi/>
+        <w:spacing w:line="580" w:lineRule="exact"/>
         <w:jc w:val="right"/>
-        <w:spacing w:line="580" w:lineRule="exact"/>
       </w:pPr>
       <w:r>
         <w:rPr>
@@ -905,8 +905,8 @@
       <w:pPr>
         <w:pStyle w:val="TOC2"/>
         <w:bidi/>
+        <w:spacing w:line="580" w:lineRule="exact"/>
         <w:jc w:val="right"/>
-        <w:spacing w:line="580" w:lineRule="exact"/>
       </w:pPr>
       <w:r>
         <w:rPr>
@@ -922,8 +922,8 @@
       <w:pPr>
         <w:pStyle w:val="TOC2"/>
         <w:bidi/>
+        <w:spacing w:line="580" w:lineRule="exact"/>
         <w:jc w:val="right"/>
-        <w:spacing w:line="580" w:lineRule="exact"/>
       </w:pPr>
       <w:r>
         <w:rPr>
@@ -939,8 +939,8 @@
       <w:pPr>
         <w:pStyle w:val="TOC3"/>
         <w:bidi/>
+        <w:spacing w:line="580" w:lineRule="exact"/>
         <w:jc w:val="right"/>
-        <w:spacing w:line="580" w:lineRule="exact"/>
       </w:pPr>
       <w:r>
         <w:rPr>
@@ -956,8 +956,8 @@
       <w:pPr>
         <w:pStyle w:val="TOC3"/>
         <w:bidi/>
+        <w:spacing w:line="580" w:lineRule="exact"/>
         <w:jc w:val="right"/>
-        <w:spacing w:line="580" w:lineRule="exact"/>
       </w:pPr>
       <w:r>
         <w:rPr>
@@ -973,8 +973,8 @@
       <w:pPr>
         <w:pStyle w:val="TOC3"/>
         <w:bidi/>
+        <w:spacing w:line="580" w:lineRule="exact"/>
         <w:jc w:val="right"/>
-        <w:spacing w:line="580" w:lineRule="exact"/>
       </w:pPr>
       <w:r>
         <w:rPr>
@@ -990,8 +990,8 @@
       <w:pPr>
         <w:pStyle w:val="TOC3"/>
         <w:bidi/>
+        <w:spacing w:line="580" w:lineRule="exact"/>
         <w:jc w:val="right"/>
-        <w:spacing w:line="580" w:lineRule="exact"/>
       </w:pPr>
       <w:r>
         <w:rPr>
@@ -1007,8 +1007,8 @@
       <w:pPr>
         <w:pStyle w:val="TOC3"/>
         <w:bidi/>
+        <w:spacing w:line="580" w:lineRule="exact"/>
         <w:jc w:val="right"/>
-        <w:spacing w:line="580" w:lineRule="exact"/>
       </w:pPr>
       <w:r>
         <w:rPr>
@@ -1024,8 +1024,8 @@
       <w:pPr>
         <w:pStyle w:val="TOC3"/>
         <w:bidi/>
+        <w:spacing w:line="580" w:lineRule="exact"/>
         <w:jc w:val="right"/>
-        <w:spacing w:line="580" w:lineRule="exact"/>
       </w:pPr>
       <w:r>
         <w:rPr>
@@ -1041,8 +1041,8 @@
       <w:pPr>
         <w:pStyle w:val="TOC3"/>
         <w:bidi/>
+        <w:spacing w:line="580" w:lineRule="exact"/>
         <w:jc w:val="right"/>
-        <w:spacing w:line="580" w:lineRule="exact"/>
       </w:pPr>
       <w:r>
         <w:rPr>
@@ -1058,8 +1058,8 @@
       <w:pPr>
         <w:pStyle w:val="TOC3"/>
         <w:bidi/>
+        <w:spacing w:line="580" w:lineRule="exact"/>
         <w:jc w:val="right"/>
-        <w:spacing w:line="580" w:lineRule="exact"/>
       </w:pPr>
       <w:r>
         <w:rPr>
@@ -1075,8 +1075,8 @@
       <w:pPr>
         <w:pStyle w:val="TOC3"/>
         <w:bidi/>
+        <w:spacing w:line="580" w:lineRule="exact"/>
         <w:jc w:val="right"/>
-        <w:spacing w:line="580" w:lineRule="exact"/>
       </w:pPr>
       <w:r>
         <w:rPr>
@@ -1092,8 +1092,8 @@
       <w:pPr>
         <w:pStyle w:val="TOC3"/>
         <w:bidi/>
+        <w:spacing w:line="580" w:lineRule="exact"/>
         <w:jc w:val="right"/>
-        <w:spacing w:line="580" w:lineRule="exact"/>
       </w:pPr>
       <w:r>
         <w:rPr>
@@ -1109,8 +1109,8 @@
       <w:pPr>
         <w:pStyle w:val="TOC3"/>
         <w:bidi/>
+        <w:spacing w:line="580" w:lineRule="exact"/>
         <w:jc w:val="right"/>
-        <w:spacing w:line="580" w:lineRule="exact"/>
       </w:pPr>
       <w:r>
         <w:rPr>
@@ -1126,8 +1126,8 @@
       <w:pPr>
         <w:pStyle w:val="TOC2"/>
         <w:bidi/>
+        <w:spacing w:line="580" w:lineRule="exact"/>
         <w:jc w:val="right"/>
-        <w:spacing w:line="580" w:lineRule="exact"/>
       </w:pPr>
       <w:r>
         <w:rPr>
@@ -1143,8 +1143,8 @@
       <w:pPr>
         <w:pStyle w:val="TOC3"/>
         <w:bidi/>
+        <w:spacing w:line="580" w:lineRule="exact"/>
         <w:jc w:val="right"/>
-        <w:spacing w:line="580" w:lineRule="exact"/>
       </w:pPr>
       <w:r>
         <w:rPr>
@@ -1160,8 +1160,8 @@
       <w:pPr>
         <w:pStyle w:val="TOC3"/>
         <w:bidi/>
+        <w:spacing w:line="580" w:lineRule="exact"/>
         <w:jc w:val="right"/>
-        <w:spacing w:line="580" w:lineRule="exact"/>
       </w:pPr>
       <w:r>
         <w:rPr>
@@ -1177,8 +1177,8 @@
       <w:pPr>
         <w:pStyle w:val="TOC3"/>
         <w:bidi/>
+        <w:spacing w:line="580" w:lineRule="exact"/>
         <w:jc w:val="right"/>
-        <w:spacing w:line="580" w:lineRule="exact"/>
       </w:pPr>
       <w:r>
         <w:rPr>
@@ -1194,8 +1194,8 @@
       <w:pPr>
         <w:pStyle w:val="TOC2"/>
         <w:bidi/>
+        <w:spacing w:line="580" w:lineRule="exact"/>
         <w:jc w:val="right"/>
-        <w:spacing w:line="580" w:lineRule="exact"/>
       </w:pPr>
       <w:r>
         <w:rPr>
@@ -1211,8 +1211,8 @@
       <w:pPr>
         <w:pStyle w:val="TOC1"/>
         <w:bidi/>
+        <w:spacing w:line="580" w:lineRule="exact"/>
         <w:jc w:val="right"/>
-        <w:spacing w:line="580" w:lineRule="exact"/>
       </w:pPr>
       <w:r>
         <w:rPr>
@@ -1230,8 +1230,8 @@
       <w:pPr>
         <w:pStyle w:val="TOC2"/>
         <w:bidi/>
+        <w:spacing w:line="580" w:lineRule="exact"/>
         <w:jc w:val="right"/>
-        <w:spacing w:line="580" w:lineRule="exact"/>
       </w:pPr>
       <w:r>
         <w:rPr>
@@ -1247,8 +1247,8 @@
       <w:pPr>
         <w:pStyle w:val="TOC2"/>
         <w:bidi/>
+        <w:spacing w:line="580" w:lineRule="exact"/>
         <w:jc w:val="right"/>
-        <w:spacing w:line="580" w:lineRule="exact"/>
       </w:pPr>
       <w:r>
         <w:rPr>
@@ -1264,8 +1264,8 @@
       <w:pPr>
         <w:pStyle w:val="TOC2"/>
         <w:bidi/>
+        <w:spacing w:line="580" w:lineRule="exact"/>
         <w:jc w:val="right"/>
-        <w:spacing w:line="580" w:lineRule="exact"/>
       </w:pPr>
       <w:r>
         <w:rPr>
@@ -1281,8 +1281,8 @@
       <w:pPr>
         <w:pStyle w:val="TOC3"/>
         <w:bidi/>
+        <w:spacing w:line="580" w:lineRule="exact"/>
         <w:jc w:val="right"/>
-        <w:spacing w:line="580" w:lineRule="exact"/>
       </w:pPr>
       <w:r>
         <w:rPr>
@@ -1298,8 +1298,8 @@
       <w:pPr>
         <w:pStyle w:val="TOC3"/>
         <w:bidi/>
+        <w:spacing w:line="580" w:lineRule="exact"/>
         <w:jc w:val="right"/>
-        <w:spacing w:line="580" w:lineRule="exact"/>
       </w:pPr>
       <w:r>
         <w:rPr>
@@ -1315,8 +1315,8 @@
       <w:pPr>
         <w:pStyle w:val="TOC3"/>
         <w:bidi/>
+        <w:spacing w:line="580" w:lineRule="exact"/>
         <w:jc w:val="right"/>
-        <w:spacing w:line="580" w:lineRule="exact"/>
       </w:pPr>
       <w:r>
         <w:rPr>
@@ -1332,8 +1332,8 @@
       <w:pPr>
         <w:pStyle w:val="TOC3"/>
         <w:bidi/>
+        <w:spacing w:line="580" w:lineRule="exact"/>
         <w:jc w:val="right"/>
-        <w:spacing w:line="580" w:lineRule="exact"/>
       </w:pPr>
       <w:r>
         <w:rPr>
@@ -1349,8 +1349,8 @@
       <w:pPr>
         <w:pStyle w:val="TOC2"/>
         <w:bidi/>
+        <w:spacing w:line="580" w:lineRule="exact"/>
         <w:jc w:val="right"/>
-        <w:spacing w:line="580" w:lineRule="exact"/>
       </w:pPr>
       <w:r>
         <w:rPr>
@@ -1366,8 +1366,8 @@
       <w:pPr>
         <w:pStyle w:val="TOC3"/>
         <w:bidi/>
+        <w:spacing w:line="580" w:lineRule="exact"/>
         <w:jc w:val="right"/>
-        <w:spacing w:line="580" w:lineRule="exact"/>
       </w:pPr>
       <w:r>
         <w:rPr>
@@ -1383,8 +1383,8 @@
       <w:pPr>
         <w:pStyle w:val="TOC3"/>
         <w:bidi/>
+        <w:spacing w:line="580" w:lineRule="exact"/>
         <w:jc w:val="right"/>
-        <w:spacing w:line="580" w:lineRule="exact"/>
       </w:pPr>
       <w:r>
         <w:rPr>
@@ -1400,8 +1400,8 @@
       <w:pPr>
         <w:pStyle w:val="TOC3"/>
         <w:bidi/>
+        <w:spacing w:line="580" w:lineRule="exact"/>
         <w:jc w:val="right"/>
-        <w:spacing w:line="580" w:lineRule="exact"/>
       </w:pPr>
       <w:r>
         <w:rPr>
@@ -1417,8 +1417,8 @@
       <w:pPr>
         <w:pStyle w:val="TOC2"/>
         <w:bidi/>
+        <w:spacing w:line="580" w:lineRule="exact"/>
         <w:jc w:val="right"/>
-        <w:spacing w:line="580" w:lineRule="exact"/>
       </w:pPr>
       <w:r>
         <w:rPr>
@@ -1434,8 +1434,8 @@
       <w:pPr>
         <w:pStyle w:val="TOC2"/>
         <w:bidi/>
+        <w:spacing w:line="580" w:lineRule="exact"/>
         <w:jc w:val="right"/>
-        <w:spacing w:line="580" w:lineRule="exact"/>
       </w:pPr>
       <w:r>
         <w:rPr>
@@ -1451,8 +1451,8 @@
       <w:pPr>
         <w:pStyle w:val="TOC2"/>
         <w:bidi/>
+        <w:spacing w:line="580" w:lineRule="exact"/>
         <w:jc w:val="right"/>
-        <w:spacing w:line="580" w:lineRule="exact"/>
       </w:pPr>
       <w:r>
         <w:rPr>
@@ -1468,8 +1468,8 @@
       <w:pPr>
         <w:pStyle w:val="TOC1"/>
         <w:bidi/>
+        <w:spacing w:line="580" w:lineRule="exact"/>
         <w:jc w:val="right"/>
-        <w:spacing w:line="580" w:lineRule="exact"/>
       </w:pPr>
       <w:r>
         <w:rPr>
@@ -1487,8 +1487,8 @@
       <w:pPr>
         <w:pStyle w:val="TOC2"/>
         <w:bidi/>
+        <w:spacing w:line="580" w:lineRule="exact"/>
         <w:jc w:val="right"/>
-        <w:spacing w:line="580" w:lineRule="exact"/>
       </w:pPr>
       <w:r>
         <w:rPr>
@@ -1504,8 +1504,8 @@
       <w:pPr>
         <w:pStyle w:val="TOC2"/>
         <w:bidi/>
+        <w:spacing w:line="580" w:lineRule="exact"/>
         <w:jc w:val="right"/>
-        <w:spacing w:line="580" w:lineRule="exact"/>
       </w:pPr>
       <w:r>
         <w:rPr>
@@ -1521,8 +1521,8 @@
       <w:pPr>
         <w:pStyle w:val="TOC2"/>
         <w:bidi/>
+        <w:spacing w:line="580" w:lineRule="exact"/>
         <w:jc w:val="right"/>
-        <w:spacing w:line="580" w:lineRule="exact"/>
       </w:pPr>
       <w:r>
         <w:rPr>
@@ -1538,8 +1538,8 @@
       <w:pPr>
         <w:pStyle w:val="TOC2"/>
         <w:bidi/>
+        <w:spacing w:line="580" w:lineRule="exact"/>
         <w:jc w:val="right"/>
-        <w:spacing w:line="580" w:lineRule="exact"/>
       </w:pPr>
       <w:r>
         <w:rPr>
@@ -1555,8 +1555,8 @@
       <w:pPr>
         <w:pStyle w:val="TOC2"/>
         <w:bidi/>
+        <w:spacing w:line="580" w:lineRule="exact"/>
         <w:jc w:val="right"/>
-        <w:spacing w:line="580" w:lineRule="exact"/>
       </w:pPr>
       <w:r>
         <w:rPr>
@@ -1572,8 +1572,8 @@
       <w:pPr>
         <w:pStyle w:val="TOC2"/>
         <w:bidi/>
+        <w:spacing w:line="580" w:lineRule="exact"/>
         <w:jc w:val="right"/>
-        <w:spacing w:line="580" w:lineRule="exact"/>
       </w:pPr>
       <w:r>
         <w:rPr>
@@ -1589,8 +1589,8 @@
       <w:pPr>
         <w:pStyle w:val="TOC2"/>
         <w:bidi/>
+        <w:spacing w:line="580" w:lineRule="exact"/>
         <w:jc w:val="right"/>
-        <w:spacing w:line="580" w:lineRule="exact"/>
       </w:pPr>
       <w:r>
         <w:rPr>
@@ -1606,8 +1606,8 @@
       <w:pPr>
         <w:pStyle w:val="TOC2"/>
         <w:bidi/>
+        <w:spacing w:line="580" w:lineRule="exact"/>
         <w:jc w:val="right"/>
-        <w:spacing w:line="580" w:lineRule="exact"/>
       </w:pPr>
       <w:r>
         <w:rPr>
@@ -1623,8 +1623,8 @@
       <w:pPr>
         <w:pStyle w:val="TOC2"/>
         <w:bidi/>
+        <w:spacing w:line="580" w:lineRule="exact"/>
         <w:jc w:val="right"/>
-        <w:spacing w:line="580" w:lineRule="exact"/>
       </w:pPr>
       <w:r>
         <w:rPr>
@@ -1640,8 +1640,8 @@
       <w:pPr>
         <w:pStyle w:val="TOC2"/>
         <w:bidi/>
+        <w:spacing w:line="580" w:lineRule="exact"/>
         <w:jc w:val="right"/>
-        <w:spacing w:line="580" w:lineRule="exact"/>
       </w:pPr>
       <w:r>
         <w:rPr>
@@ -1657,8 +1657,8 @@
       <w:pPr>
         <w:pStyle w:val="TOC1"/>
         <w:bidi/>
+        <w:spacing w:line="580" w:lineRule="exact"/>
         <w:jc w:val="right"/>
-        <w:spacing w:line="580" w:lineRule="exact"/>
       </w:pPr>
       <w:r>
         <w:rPr>
@@ -1676,8 +1676,8 @@
       <w:pPr>
         <w:pStyle w:val="TOC2"/>
         <w:bidi/>
+        <w:spacing w:line="580" w:lineRule="exact"/>
         <w:jc w:val="right"/>
-        <w:spacing w:line="580" w:lineRule="exact"/>
       </w:pPr>
       <w:r>
         <w:rPr>
@@ -1693,8 +1693,8 @@
       <w:pPr>
         <w:pStyle w:val="TOC2"/>
         <w:bidi/>
+        <w:spacing w:line="580" w:lineRule="exact"/>
         <w:jc w:val="right"/>
-        <w:spacing w:line="580" w:lineRule="exact"/>
       </w:pPr>
       <w:r>
         <w:rPr>
@@ -1710,8 +1710,8 @@
       <w:pPr>
         <w:pStyle w:val="TOC2"/>
         <w:bidi/>
+        <w:spacing w:line="580" w:lineRule="exact"/>
         <w:jc w:val="right"/>
-        <w:spacing w:line="580" w:lineRule="exact"/>
       </w:pPr>
       <w:r>
         <w:rPr>
@@ -1727,8 +1727,8 @@
       <w:pPr>
         <w:pStyle w:val="TOC3"/>
         <w:bidi/>
+        <w:spacing w:line="580" w:lineRule="exact"/>
         <w:jc w:val="right"/>
-        <w:spacing w:line="580" w:lineRule="exact"/>
       </w:pPr>
       <w:r>
         <w:rPr>
@@ -1744,8 +1744,8 @@
       <w:pPr>
         <w:pStyle w:val="TOC3"/>
         <w:bidi/>
+        <w:spacing w:line="580" w:lineRule="exact"/>
         <w:jc w:val="right"/>
-        <w:spacing w:line="580" w:lineRule="exact"/>
       </w:pPr>
       <w:r>
         <w:rPr>
@@ -1761,8 +1761,8 @@
       <w:pPr>
         <w:pStyle w:val="TOC3"/>
         <w:bidi/>
+        <w:spacing w:line="580" w:lineRule="exact"/>
         <w:jc w:val="right"/>
-        <w:spacing w:line="580" w:lineRule="exact"/>
       </w:pPr>
       <w:r>
         <w:rPr>
@@ -1778,8 +1778,8 @@
       <w:pPr>
         <w:pStyle w:val="TOC3"/>
         <w:bidi/>
+        <w:spacing w:line="580" w:lineRule="exact"/>
         <w:jc w:val="right"/>
-        <w:spacing w:line="580" w:lineRule="exact"/>
       </w:pPr>
       <w:r>
         <w:rPr>
@@ -1795,8 +1795,8 @@
       <w:pPr>
         <w:pStyle w:val="TOC3"/>
         <w:bidi/>
+        <w:spacing w:line="580" w:lineRule="exact"/>
         <w:jc w:val="right"/>
-        <w:spacing w:line="580" w:lineRule="exact"/>
       </w:pPr>
       <w:r>
         <w:rPr>
@@ -1812,8 +1812,8 @@
       <w:pPr>
         <w:pStyle w:val="TOC2"/>
         <w:bidi/>
+        <w:spacing w:line="580" w:lineRule="exact"/>
         <w:jc w:val="right"/>
-        <w:spacing w:line="580" w:lineRule="exact"/>
       </w:pPr>
       <w:r>
         <w:rPr>
@@ -1829,8 +1829,8 @@
       <w:pPr>
         <w:pStyle w:val="TOC2"/>
         <w:bidi/>
+        <w:spacing w:line="580" w:lineRule="exact"/>
         <w:jc w:val="right"/>
-        <w:spacing w:line="580" w:lineRule="exact"/>
       </w:pPr>
       <w:r>
         <w:rPr>
@@ -1846,8 +1846,8 @@
       <w:pPr>
         <w:pStyle w:val="TOC2"/>
         <w:bidi/>
+        <w:spacing w:line="580" w:lineRule="exact"/>
         <w:jc w:val="right"/>
-        <w:spacing w:line="580" w:lineRule="exact"/>
       </w:pPr>
       <w:r>
         <w:rPr>
@@ -1863,8 +1863,8 @@
       <w:pPr>
         <w:pStyle w:val="TOC2"/>
         <w:bidi/>
+        <w:spacing w:line="580" w:lineRule="exact"/>
         <w:jc w:val="right"/>
-        <w:spacing w:line="580" w:lineRule="exact"/>
       </w:pPr>
       <w:r>
         <w:rPr>
@@ -1880,8 +1880,8 @@
       <w:pPr>
         <w:pStyle w:val="TOC2"/>
         <w:bidi/>
+        <w:spacing w:line="580" w:lineRule="exact"/>
         <w:jc w:val="right"/>
-        <w:spacing w:line="580" w:lineRule="exact"/>
       </w:pPr>
       <w:r>
         <w:rPr>
@@ -1897,8 +1897,8 @@
       <w:pPr>
         <w:pStyle w:val="TOC1"/>
         <w:bidi/>
+        <w:spacing w:line="580" w:lineRule="exact"/>
         <w:jc w:val="right"/>
-        <w:spacing w:line="580" w:lineRule="exact"/>
       </w:pPr>
       <w:r>
         <w:rPr>
@@ -1928,8 +1928,8 @@
     <w:p>
       <w:pPr>
         <w:bidi/>
+        <w:spacing w:line="580" w:lineRule="exact"/>
         <w:jc w:val="center"/>
-        <w:spacing w:line="580" w:lineRule="exact"/>
       </w:pPr>
       <w:r>
         <w:rPr>
@@ -1970,8 +1970,8 @@
       <w:pPr>
         <w:pStyle w:val="tableoffigures"/>
         <w:bidi/>
+        <w:spacing w:line="580" w:lineRule="exact"/>
         <w:jc w:val="right"/>
-        <w:spacing w:line="580" w:lineRule="exact"/>
       </w:pPr>
       <w:r>
         <w:rPr>
@@ -1987,8 +1987,8 @@
       <w:pPr>
         <w:pStyle w:val="tableoffigures"/>
         <w:bidi/>
+        <w:spacing w:line="580" w:lineRule="exact"/>
         <w:jc w:val="right"/>
-        <w:spacing w:line="580" w:lineRule="exact"/>
       </w:pPr>
       <w:r>
         <w:rPr>
@@ -2004,8 +2004,8 @@
       <w:pPr>
         <w:pStyle w:val="tableoffigures"/>
         <w:bidi/>
+        <w:spacing w:line="580" w:lineRule="exact"/>
         <w:jc w:val="right"/>
-        <w:spacing w:line="580" w:lineRule="exact"/>
       </w:pPr>
       <w:r>
         <w:rPr>
@@ -2021,8 +2021,8 @@
       <w:pPr>
         <w:pStyle w:val="tableoffigures"/>
         <w:bidi/>
+        <w:spacing w:line="580" w:lineRule="exact"/>
         <w:jc w:val="right"/>
-        <w:spacing w:line="580" w:lineRule="exact"/>
       </w:pPr>
       <w:r>
         <w:rPr>
@@ -2038,8 +2038,8 @@
       <w:pPr>
         <w:pStyle w:val="tableoffigures"/>
         <w:bidi/>
+        <w:spacing w:line="580" w:lineRule="exact"/>
         <w:jc w:val="right"/>
-        <w:spacing w:line="580" w:lineRule="exact"/>
       </w:pPr>
       <w:r>
         <w:rPr>
@@ -2055,8 +2055,8 @@
       <w:pPr>
         <w:pStyle w:val="tableoffigures"/>
         <w:bidi/>
+        <w:spacing w:line="580" w:lineRule="exact"/>
         <w:jc w:val="right"/>
-        <w:spacing w:line="580" w:lineRule="exact"/>
       </w:pPr>
       <w:r>
         <w:rPr>
@@ -2072,8 +2072,8 @@
       <w:pPr>
         <w:pStyle w:val="tableoffigures"/>
         <w:bidi/>
+        <w:spacing w:line="580" w:lineRule="exact"/>
         <w:jc w:val="right"/>
-        <w:spacing w:line="580" w:lineRule="exact"/>
       </w:pPr>
       <w:r>
         <w:rPr>
@@ -2089,8 +2089,8 @@
       <w:pPr>
         <w:pStyle w:val="tableoffigures"/>
         <w:bidi/>
+        <w:spacing w:line="580" w:lineRule="exact"/>
         <w:jc w:val="right"/>
-        <w:spacing w:line="580" w:lineRule="exact"/>
       </w:pPr>
       <w:r>
         <w:rPr>
@@ -2106,8 +2106,8 @@
       <w:pPr>
         <w:pStyle w:val="tableoffigures"/>
         <w:bidi/>
+        <w:spacing w:line="580" w:lineRule="exact"/>
         <w:jc w:val="right"/>
-        <w:spacing w:line="580" w:lineRule="exact"/>
       </w:pPr>
       <w:r>
         <w:rPr>
@@ -2123,8 +2123,8 @@
       <w:pPr>
         <w:pStyle w:val="tableoffigures"/>
         <w:bidi/>
+        <w:spacing w:line="580" w:lineRule="exact"/>
         <w:jc w:val="right"/>
-        <w:spacing w:line="580" w:lineRule="exact"/>
       </w:pPr>
       <w:r>
         <w:rPr>
@@ -2140,37 +2140,37 @@
       <w:pPr>
         <w:pStyle w:val="tableoffigures"/>
         <w:bidi/>
+        <w:spacing w:line="580" w:lineRule="exact"/>
         <w:jc w:val="right"/>
+      </w:pPr>
+      <w:r>
+        <w:rPr>
+          <w:rFonts w:ascii="B Nazanin" w:hAnsi="B Nazanin" w:cs="B Nazanin"/>
+          <w:sz w:val="24"/>
+          <w:szCs w:val="24"/>
+          <w:rtl/>
+        </w:rPr>
+        <w:t>جدول ۴-۹. خلاصه نتایج آزمون فرضیه‌ها</w:t>
+      </w:r>
+    </w:p>
+    <w:p>
+      <w:pPr>
+        <w:bidi/>
+      </w:pPr>
+      <w:r>
+        <w:fldChar w:fldCharType="end"/>
+      </w:r>
+    </w:p>
+    <w:p>
+      <w:r>
+        <w:br w:type="page"/>
+      </w:r>
+    </w:p>
+    <w:p>
+      <w:pPr>
+        <w:bidi/>
         <w:spacing w:line="580" w:lineRule="exact"/>
-      </w:pPr>
-      <w:r>
-        <w:rPr>
-          <w:rFonts w:ascii="B Nazanin" w:hAnsi="B Nazanin" w:cs="B Nazanin"/>
-          <w:sz w:val="24"/>
-          <w:szCs w:val="24"/>
-          <w:rtl/>
-        </w:rPr>
-        <w:t>جدول ۴-۹. خلاصه نتایج آزمون فرضیه‌ها</w:t>
-      </w:r>
-    </w:p>
-    <w:p>
-      <w:pPr>
-        <w:bidi/>
-      </w:pPr>
-      <w:r>
-        <w:fldChar w:fldCharType="end"/>
-      </w:r>
-    </w:p>
-    <w:p>
-      <w:r>
-        <w:br w:type="page"/>
-      </w:r>
-    </w:p>
-    <w:p>
-      <w:pPr>
-        <w:bidi/>
         <w:jc w:val="center"/>
-        <w:spacing w:line="580" w:lineRule="exact"/>
       </w:pPr>
       <w:r>
         <w:rPr>
@@ -2211,8 +2211,8 @@
       <w:pPr>
         <w:pStyle w:val="tableoffigures"/>
         <w:bidi/>
+        <w:spacing w:line="580" w:lineRule="exact"/>
         <w:jc w:val="right"/>
-        <w:spacing w:line="580" w:lineRule="exact"/>
       </w:pPr>
       <w:r>
         <w:rPr>
@@ -2228,37 +2228,37 @@
       <w:pPr>
         <w:pStyle w:val="tableoffigures"/>
         <w:bidi/>
+        <w:spacing w:line="580" w:lineRule="exact"/>
         <w:jc w:val="right"/>
+      </w:pPr>
+      <w:r>
+        <w:rPr>
+          <w:rFonts w:ascii="B Nazanin" w:hAnsi="B Nazanin" w:cs="B Nazanin"/>
+          <w:sz w:val="24"/>
+          <w:szCs w:val="24"/>
+          <w:rtl/>
+        </w:rPr>
+        <w:t>شکل ۴-۱. نمودار مسیر الگوی میانجی‌گری با ضرایب برآوردشده در نمونه نهایی</w:t>
+      </w:r>
+    </w:p>
+    <w:p>
+      <w:pPr>
+        <w:bidi/>
+      </w:pPr>
+      <w:r>
+        <w:fldChar w:fldCharType="end"/>
+      </w:r>
+    </w:p>
+    <w:p>
+      <w:r>
+        <w:br w:type="page"/>
+      </w:r>
+    </w:p>
+    <w:p>
+      <w:pPr>
+        <w:bidi/>
         <w:spacing w:line="580" w:lineRule="exact"/>
-      </w:pPr>
-      <w:r>
-        <w:rPr>
-          <w:rFonts w:ascii="B Nazanin" w:hAnsi="B Nazanin" w:cs="B Nazanin"/>
-          <w:sz w:val="24"/>
-          <w:szCs w:val="24"/>
-          <w:rtl/>
-        </w:rPr>
-        <w:t>شکل ۴-۱. نمودار مسیر الگوی میانجی‌گری با ضرایب برآوردشده در نمونه نهایی</w:t>
-      </w:r>
-    </w:p>
-    <w:p>
-      <w:pPr>
-        <w:bidi/>
-      </w:pPr>
-      <w:r>
-        <w:fldChar w:fldCharType="end"/>
-      </w:r>
-    </w:p>
-    <w:p>
-      <w:r>
-        <w:br w:type="page"/>
-      </w:r>
-    </w:p>
-    <w:p>
-      <w:pPr>
-        <w:bidi/>
         <w:jc w:val="center"/>
-        <w:spacing w:line="580" w:lineRule="exact"/>
       </w:pPr>
       <w:r>
         <w:rPr>
@@ -2277,22 +2277,21 @@
       <w:tblPr>
         <w:tblStyle w:val="TableGrid"/>
         <w:bidiVisual/>
-        <w:tblGrid>
-          <w:gridCol w:w="2200"/>
-          <w:gridCol w:w="6021"/>
-        </w:tblGrid>
       </w:tblPr>
+      <w:tblGrid>
+        <w:gridCol w:w="2200"/>
+        <w:gridCol w:w="6021"/>
+      </w:tblGrid>
       <w:tr>
         <w:tc>
           <w:tcPr>
-            <w:tcW w:w="2200"/>
-            <w:tcW w:type="dxa"/>
+            <w:tcW w:w="2200" w:type="dxa"/>
           </w:tcPr>
           <w:p>
             <w:pPr>
               <w:bidi/>
+              <w:spacing w:line="580" w:lineRule="exact"/>
               <w:jc w:val="center"/>
-              <w:spacing w:line="580" w:lineRule="exact"/>
             </w:pPr>
             <w:r>
               <w:rPr>
@@ -2309,14 +2308,13 @@
         </w:tc>
         <w:tc>
           <w:tcPr>
-            <w:tcW w:w="6021"/>
-            <w:tcW w:type="dxa"/>
+            <w:tcW w:w="6021" w:type="dxa"/>
           </w:tcPr>
           <w:p>
             <w:pPr>
               <w:bidi/>
+              <w:spacing w:line="580" w:lineRule="exact"/>
               <w:jc w:val="right"/>
-              <w:spacing w:line="580" w:lineRule="exact"/>
             </w:pPr>
             <w:r>
               <w:rPr>
@@ -2335,13 +2333,12 @@
       <w:tr>
         <w:tc>
           <w:tcPr>
-            <w:tcW w:w="2200"/>
-            <w:tcW w:type="dxa"/>
+            <w:tcW w:w="2200" w:type="dxa"/>
           </w:tcPr>
           <w:p>
             <w:pPr>
+              <w:spacing w:line="580" w:lineRule="exact"/>
               <w:jc w:val="center"/>
-              <w:spacing w:line="580" w:lineRule="exact"/>
             </w:pPr>
             <w:r>
               <w:rPr>
@@ -2355,14 +2352,13 @@
         </w:tc>
         <w:tc>
           <w:tcPr>
-            <w:tcW w:w="6021"/>
-            <w:tcW w:type="dxa"/>
+            <w:tcW w:w="6021" w:type="dxa"/>
           </w:tcPr>
           <w:p>
             <w:pPr>
               <w:bidi/>
+              <w:spacing w:line="580" w:lineRule="exact"/>
               <w:jc w:val="right"/>
-              <w:spacing w:line="580" w:lineRule="exact"/>
             </w:pPr>
             <w:r>
               <w:rPr>
@@ -2379,13 +2375,12 @@
       <w:tr>
         <w:tc>
           <w:tcPr>
-            <w:tcW w:w="2200"/>
-            <w:tcW w:type="dxa"/>
+            <w:tcW w:w="2200" w:type="dxa"/>
           </w:tcPr>
           <w:p>
             <w:pPr>
+              <w:spacing w:line="580" w:lineRule="exact"/>
               <w:jc w:val="center"/>
-              <w:spacing w:line="580" w:lineRule="exact"/>
             </w:pPr>
             <w:r>
               <w:rPr>
@@ -2399,14 +2394,13 @@
         </w:tc>
         <w:tc>
           <w:tcPr>
-            <w:tcW w:w="6021"/>
-            <w:tcW w:type="dxa"/>
+            <w:tcW w:w="6021" w:type="dxa"/>
           </w:tcPr>
           <w:p>
             <w:pPr>
               <w:bidi/>
+              <w:spacing w:line="580" w:lineRule="exact"/>
               <w:jc w:val="right"/>
-              <w:spacing w:line="580" w:lineRule="exact"/>
             </w:pPr>
             <w:r>
               <w:rPr>
@@ -2423,13 +2417,12 @@
       <w:tr>
         <w:tc>
           <w:tcPr>
-            <w:tcW w:w="2200"/>
-            <w:tcW w:type="dxa"/>
+            <w:tcW w:w="2200" w:type="dxa"/>
           </w:tcPr>
           <w:p>
             <w:pPr>
+              <w:spacing w:line="580" w:lineRule="exact"/>
               <w:jc w:val="center"/>
-              <w:spacing w:line="580" w:lineRule="exact"/>
             </w:pPr>
             <w:r>
               <w:rPr>
@@ -2443,14 +2436,13 @@
         </w:tc>
         <w:tc>
           <w:tcPr>
-            <w:tcW w:w="6021"/>
-            <w:tcW w:type="dxa"/>
+            <w:tcW w:w="6021" w:type="dxa"/>
           </w:tcPr>
           <w:p>
             <w:pPr>
               <w:bidi/>
+              <w:spacing w:line="580" w:lineRule="exact"/>
               <w:jc w:val="right"/>
-              <w:spacing w:line="580" w:lineRule="exact"/>
             </w:pPr>
             <w:r>
               <w:rPr>
@@ -2467,13 +2459,12 @@
       <w:tr>
         <w:tc>
           <w:tcPr>
-            <w:tcW w:w="2200"/>
-            <w:tcW w:type="dxa"/>
+            <w:tcW w:w="2200" w:type="dxa"/>
           </w:tcPr>
           <w:p>
             <w:pPr>
+              <w:spacing w:line="580" w:lineRule="exact"/>
               <w:jc w:val="center"/>
-              <w:spacing w:line="580" w:lineRule="exact"/>
             </w:pPr>
             <w:r>
               <w:rPr>
@@ -2487,14 +2478,13 @@
         </w:tc>
         <w:tc>
           <w:tcPr>
-            <w:tcW w:w="6021"/>
-            <w:tcW w:type="dxa"/>
+            <w:tcW w:w="6021" w:type="dxa"/>
           </w:tcPr>
           <w:p>
             <w:pPr>
               <w:bidi/>
+              <w:spacing w:line="580" w:lineRule="exact"/>
               <w:jc w:val="right"/>
-              <w:spacing w:line="580" w:lineRule="exact"/>
             </w:pPr>
             <w:r>
               <w:rPr>
@@ -2511,13 +2501,12 @@
       <w:tr>
         <w:tc>
           <w:tcPr>
-            <w:tcW w:w="2200"/>
-            <w:tcW w:type="dxa"/>
+            <w:tcW w:w="2200" w:type="dxa"/>
           </w:tcPr>
           <w:p>
             <w:pPr>
+              <w:spacing w:line="580" w:lineRule="exact"/>
               <w:jc w:val="center"/>
-              <w:spacing w:line="580" w:lineRule="exact"/>
             </w:pPr>
             <w:r>
               <w:rPr>
@@ -2531,14 +2520,13 @@
         </w:tc>
         <w:tc>
           <w:tcPr>
-            <w:tcW w:w="6021"/>
-            <w:tcW w:type="dxa"/>
+            <w:tcW w:w="6021" w:type="dxa"/>
           </w:tcPr>
           <w:p>
             <w:pPr>
               <w:bidi/>
+              <w:spacing w:line="580" w:lineRule="exact"/>
               <w:jc w:val="right"/>
-              <w:spacing w:line="580" w:lineRule="exact"/>
             </w:pPr>
             <w:r>
               <w:rPr>
@@ -2555,13 +2543,12 @@
       <w:tr>
         <w:tc>
           <w:tcPr>
-            <w:tcW w:w="2200"/>
-            <w:tcW w:type="dxa"/>
+            <w:tcW w:w="2200" w:type="dxa"/>
           </w:tcPr>
           <w:p>
             <w:pPr>
+              <w:spacing w:line="580" w:lineRule="exact"/>
               <w:jc w:val="center"/>
-              <w:spacing w:line="580" w:lineRule="exact"/>
             </w:pPr>
             <w:r>
               <w:rPr>
@@ -2575,14 +2562,13 @@
         </w:tc>
         <w:tc>
           <w:tcPr>
-            <w:tcW w:w="6021"/>
-            <w:tcW w:type="dxa"/>
+            <w:tcW w:w="6021" w:type="dxa"/>
           </w:tcPr>
           <w:p>
             <w:pPr>
               <w:bidi/>
+              <w:spacing w:line="580" w:lineRule="exact"/>
               <w:jc w:val="right"/>
-              <w:spacing w:line="580" w:lineRule="exact"/>
             </w:pPr>
             <w:r>
               <w:rPr>
@@ -2599,13 +2585,12 @@
       <w:tr>
         <w:tc>
           <w:tcPr>
-            <w:tcW w:w="2200"/>
-            <w:tcW w:type="dxa"/>
+            <w:tcW w:w="2200" w:type="dxa"/>
           </w:tcPr>
           <w:p>
             <w:pPr>
+              <w:spacing w:line="580" w:lineRule="exact"/>
               <w:jc w:val="center"/>
-              <w:spacing w:line="580" w:lineRule="exact"/>
             </w:pPr>
             <w:r>
               <w:rPr>
@@ -2619,14 +2604,13 @@
         </w:tc>
         <w:tc>
           <w:tcPr>
-            <w:tcW w:w="6021"/>
-            <w:tcW w:type="dxa"/>
+            <w:tcW w:w="6021" w:type="dxa"/>
           </w:tcPr>
           <w:p>
             <w:pPr>
               <w:bidi/>
+              <w:spacing w:line="580" w:lineRule="exact"/>
               <w:jc w:val="right"/>
-              <w:spacing w:line="580" w:lineRule="exact"/>
             </w:pPr>
             <w:r>
               <w:rPr>
@@ -2643,13 +2627,12 @@
       <w:tr>
         <w:tc>
           <w:tcPr>
-            <w:tcW w:w="2200"/>
-            <w:tcW w:type="dxa"/>
+            <w:tcW w:w="2200" w:type="dxa"/>
           </w:tcPr>
           <w:p>
             <w:pPr>
+              <w:spacing w:line="580" w:lineRule="exact"/>
               <w:jc w:val="center"/>
-              <w:spacing w:line="580" w:lineRule="exact"/>
             </w:pPr>
             <w:r>
               <w:rPr>
@@ -2663,14 +2646,13 @@
         </w:tc>
         <w:tc>
           <w:tcPr>
-            <w:tcW w:w="6021"/>
-            <w:tcW w:type="dxa"/>
+            <w:tcW w:w="6021" w:type="dxa"/>
           </w:tcPr>
           <w:p>
             <w:pPr>
               <w:bidi/>
+              <w:spacing w:line="580" w:lineRule="exact"/>
               <w:jc w:val="right"/>
-              <w:spacing w:line="580" w:lineRule="exact"/>
             </w:pPr>
             <w:r>
               <w:rPr>
@@ -2687,13 +2669,12 @@
       <w:tr>
         <w:tc>
           <w:tcPr>
-            <w:tcW w:w="2200"/>
-            <w:tcW w:type="dxa"/>
+            <w:tcW w:w="2200" w:type="dxa"/>
           </w:tcPr>
           <w:p>
             <w:pPr>
+              <w:spacing w:line="580" w:lineRule="exact"/>
               <w:jc w:val="center"/>
-              <w:spacing w:line="580" w:lineRule="exact"/>
             </w:pPr>
             <w:r>
               <w:rPr>
@@ -2707,14 +2688,13 @@
         </w:tc>
         <w:tc>
           <w:tcPr>
-            <w:tcW w:w="6021"/>
-            <w:tcW w:type="dxa"/>
+            <w:tcW w:w="6021" w:type="dxa"/>
           </w:tcPr>
           <w:p>
             <w:pPr>
               <w:bidi/>
+              <w:spacing w:line="580" w:lineRule="exact"/>
               <w:jc w:val="right"/>
-              <w:spacing w:line="580" w:lineRule="exact"/>
             </w:pPr>
             <w:r>
               <w:rPr>
@@ -2731,13 +2711,12 @@
       <w:tr>
         <w:tc>
           <w:tcPr>
-            <w:tcW w:w="2200"/>
-            <w:tcW w:type="dxa"/>
+            <w:tcW w:w="2200" w:type="dxa"/>
           </w:tcPr>
           <w:p>
             <w:pPr>
+              <w:spacing w:line="580" w:lineRule="exact"/>
               <w:jc w:val="center"/>
-              <w:spacing w:line="580" w:lineRule="exact"/>
             </w:pPr>
             <w:r>
               <w:rPr>
@@ -2751,14 +2730,13 @@
         </w:tc>
         <w:tc>
           <w:tcPr>
-            <w:tcW w:w="6021"/>
-            <w:tcW w:type="dxa"/>
+            <w:tcW w:w="6021" w:type="dxa"/>
           </w:tcPr>
           <w:p>
             <w:pPr>
               <w:bidi/>
+              <w:spacing w:line="580" w:lineRule="exact"/>
               <w:jc w:val="right"/>
-              <w:spacing w:line="580" w:lineRule="exact"/>
             </w:pPr>
             <w:r>
               <w:rPr>
@@ -2775,13 +2753,12 @@
       <w:tr>
         <w:tc>
           <w:tcPr>
-            <w:tcW w:w="2200"/>
-            <w:tcW w:type="dxa"/>
+            <w:tcW w:w="2200" w:type="dxa"/>
           </w:tcPr>
           <w:p>
             <w:pPr>
+              <w:spacing w:line="580" w:lineRule="exact"/>
               <w:jc w:val="center"/>
-              <w:spacing w:line="580" w:lineRule="exact"/>
             </w:pPr>
             <w:r>
               <w:rPr>
@@ -2795,14 +2772,13 @@
         </w:tc>
         <w:tc>
           <w:tcPr>
-            <w:tcW w:w="6021"/>
-            <w:tcW w:type="dxa"/>
+            <w:tcW w:w="6021" w:type="dxa"/>
           </w:tcPr>
           <w:p>
             <w:pPr>
               <w:bidi/>
+              <w:spacing w:line="580" w:lineRule="exact"/>
               <w:jc w:val="right"/>
-              <w:spacing w:line="580" w:lineRule="exact"/>
             </w:pPr>
             <w:r>
               <w:rPr>
@@ -2819,13 +2795,12 @@
       <w:tr>
         <w:tc>
           <w:tcPr>
-            <w:tcW w:w="2200"/>
-            <w:tcW w:type="dxa"/>
+            <w:tcW w:w="2200" w:type="dxa"/>
           </w:tcPr>
           <w:p>
             <w:pPr>
+              <w:spacing w:line="580" w:lineRule="exact"/>
               <w:jc w:val="center"/>
-              <w:spacing w:line="580" w:lineRule="exact"/>
             </w:pPr>
             <w:r>
               <w:rPr>
@@ -2839,14 +2814,13 @@
         </w:tc>
         <w:tc>
           <w:tcPr>
-            <w:tcW w:w="6021"/>
-            <w:tcW w:type="dxa"/>
+            <w:tcW w:w="6021" w:type="dxa"/>
           </w:tcPr>
           <w:p>
             <w:pPr>
               <w:bidi/>
+              <w:spacing w:line="580" w:lineRule="exact"/>
               <w:jc w:val="right"/>
-              <w:spacing w:line="580" w:lineRule="exact"/>
             </w:pPr>
             <w:r>
               <w:rPr>
@@ -2863,13 +2837,12 @@
       <w:tr>
         <w:tc>
           <w:tcPr>
-            <w:tcW w:w="2200"/>
-            <w:tcW w:type="dxa"/>
+            <w:tcW w:w="2200" w:type="dxa"/>
           </w:tcPr>
           <w:p>
             <w:pPr>
+              <w:spacing w:line="580" w:lineRule="exact"/>
               <w:jc w:val="center"/>
-              <w:spacing w:line="580" w:lineRule="exact"/>
             </w:pPr>
             <w:r>
               <w:rPr>
@@ -2883,14 +2856,13 @@
         </w:tc>
         <w:tc>
           <w:tcPr>
-            <w:tcW w:w="6021"/>
-            <w:tcW w:type="dxa"/>
+            <w:tcW w:w="6021" w:type="dxa"/>
           </w:tcPr>
           <w:p>
             <w:pPr>
               <w:bidi/>
+              <w:spacing w:line="580" w:lineRule="exact"/>
               <w:jc w:val="right"/>
-              <w:spacing w:line="580" w:lineRule="exact"/>
             </w:pPr>
             <w:r>
               <w:rPr>
@@ -2907,13 +2879,12 @@
       <w:tr>
         <w:tc>
           <w:tcPr>
-            <w:tcW w:w="2200"/>
-            <w:tcW w:type="dxa"/>
+            <w:tcW w:w="2200" w:type="dxa"/>
           </w:tcPr>
           <w:p>
             <w:pPr>
+              <w:spacing w:line="580" w:lineRule="exact"/>
               <w:jc w:val="center"/>
-              <w:spacing w:line="580" w:lineRule="exact"/>
             </w:pPr>
             <w:r>
               <w:rPr>
@@ -2927,14 +2898,13 @@
         </w:tc>
         <w:tc>
           <w:tcPr>
-            <w:tcW w:w="6021"/>
-            <w:tcW w:type="dxa"/>
+            <w:tcW w:w="6021" w:type="dxa"/>
           </w:tcPr>
           <w:p>
             <w:pPr>
               <w:bidi/>
+              <w:spacing w:line="580" w:lineRule="exact"/>
               <w:jc w:val="right"/>
-              <w:spacing w:line="580" w:lineRule="exact"/>
             </w:pPr>
             <w:r>
               <w:rPr>
@@ -2951,13 +2921,12 @@
       <w:tr>
         <w:tc>
           <w:tcPr>
-            <w:tcW w:w="2200"/>
-            <w:tcW w:type="dxa"/>
+            <w:tcW w:w="2200" w:type="dxa"/>
           </w:tcPr>
           <w:p>
             <w:pPr>
+              <w:spacing w:line="580" w:lineRule="exact"/>
               <w:jc w:val="center"/>
-              <w:spacing w:line="580" w:lineRule="exact"/>
             </w:pPr>
             <w:r>
               <w:rPr>
@@ -2971,14 +2940,13 @@
         </w:tc>
         <w:tc>
           <w:tcPr>
-            <w:tcW w:w="6021"/>
-            <w:tcW w:type="dxa"/>
+            <w:tcW w:w="6021" w:type="dxa"/>
           </w:tcPr>
           <w:p>
             <w:pPr>
               <w:bidi/>
+              <w:spacing w:line="580" w:lineRule="exact"/>
               <w:jc w:val="right"/>
-              <w:spacing w:line="580" w:lineRule="exact"/>
             </w:pPr>
             <w:r>
               <w:rPr>
@@ -2995,13 +2963,12 @@
       <w:tr>
         <w:tc>
           <w:tcPr>
-            <w:tcW w:w="2200"/>
-            <w:tcW w:type="dxa"/>
+            <w:tcW w:w="2200" w:type="dxa"/>
           </w:tcPr>
           <w:p>
             <w:pPr>
+              <w:spacing w:line="580" w:lineRule="exact"/>
               <w:jc w:val="center"/>
-              <w:spacing w:line="580" w:lineRule="exact"/>
             </w:pPr>
             <w:r>
               <w:rPr>
@@ -3015,14 +2982,13 @@
         </w:tc>
         <w:tc>
           <w:tcPr>
-            <w:tcW w:w="6021"/>
-            <w:tcW w:type="dxa"/>
+            <w:tcW w:w="6021" w:type="dxa"/>
           </w:tcPr>
           <w:p>
             <w:pPr>
               <w:bidi/>
+              <w:spacing w:line="580" w:lineRule="exact"/>
               <w:jc w:val="right"/>
-              <w:spacing w:line="580" w:lineRule="exact"/>
             </w:pPr>
             <w:r>
               <w:rPr>
@@ -3042,7 +3008,7 @@
         <w:sectPr>
           <w:footerReference w:type="default" r:id="rId21"/>
           <w:footnotePr>
-            <w:numFmt w:val="hindi"/>
+            <w:numFmt w:val="decimal"/>
             <w:numRestart w:val="eachPage"/>
           </w:footnotePr>
           <w:pgSz w:w="11906" w:h="16838"/>
@@ -3060,7 +3026,6 @@
         <w:spacing w:lineRule="exact" w:line="580" w:before="480" w:after="180"/>
         <w:jc w:val="center"/>
         <w:outlineLvl w:val="0"/>
-        <w:outlineLvl w:val="0"/>
       </w:pPr>
       <w:r>
         <w:rPr>
@@ -5903,12 +5868,12 @@
         <w:sectPr>
           <w:footerReference w:type="default" r:id="rId22"/>
           <w:footnotePr>
-            <w:numFmt w:val="hindi"/>
+            <w:numFmt w:val="decimal"/>
             <w:numRestart w:val="eachPage"/>
           </w:footnotePr>
           <w:pgSz w:w="11906" w:h="16838"/>
           <w:pgMar w:top="1701" w:right="2268" w:bottom="1417" w:left="1417" w:header="720" w:footer="567" w:gutter="0"/>
-          <w:pgNumType w:fmt="hindi" w:start="1"/>
+          <w:pgNumType w:fmt="decimal" w:start="1"/>
           <w:cols w:space="720"/>
           <w:titlePg/>
           <w:bidi/>
@@ -5922,7 +5887,6 @@
         <w:spacing w:lineRule="exact" w:line="580" w:before="480" w:after="180"/>
         <w:jc w:val="center"/>
         <w:outlineLvl w:val="0"/>
-        <w:outlineLvl w:val="0"/>
       </w:pPr>
       <w:r>
         <w:rPr>
@@ -8051,9 +8015,9 @@
     <w:tbl>
       <w:tblPr>
         <w:tblStyle w:val="TableGrid"/>
+        <w:bidiVisual/>
         <w:tblW w:type="auto" w:w="0"/>
         <w:tblLook w:firstColumn="1" w:firstRow="1" w:lastColumn="0" w:lastRow="0" w:noHBand="0" w:noVBand="1" w:val="04A0"/>
-        <w:bidiVisual/>
       </w:tblPr>
       <w:tblGrid>
         <w:gridCol w:w="2740"/>
@@ -10532,9 +10496,9 @@
     <w:tbl>
       <w:tblPr>
         <w:tblStyle w:val="TableGrid"/>
+        <w:bidiVisual/>
         <w:tblW w:type="auto" w:w="0"/>
         <w:tblLook w:firstColumn="1" w:firstRow="1" w:lastColumn="0" w:lastRow="0" w:noHBand="0" w:noVBand="1" w:val="04A0"/>
-        <w:bidiVisual/>
       </w:tblPr>
       <w:tblGrid>
         <w:gridCol w:w="2740"/>
@@ -11096,12 +11060,12 @@
         <w:sectPr>
           <w:footerReference w:type="default" r:id="rId22"/>
           <w:footnotePr>
-            <w:numFmt w:val="hindi"/>
+            <w:numFmt w:val="decimal"/>
             <w:numRestart w:val="eachPage"/>
           </w:footnotePr>
           <w:pgSz w:w="11906" w:h="16838"/>
           <w:pgMar w:top="1701" w:right="2268" w:bottom="1417" w:left="1417" w:header="720" w:footer="567" w:gutter="0"/>
-          <w:pgNumType w:fmt="hindi"/>
+          <w:pgNumType w:fmt="decimal"/>
           <w:cols w:space="720"/>
           <w:titlePg/>
           <w:bidi/>
@@ -11115,7 +11079,6 @@
         <w:spacing w:lineRule="exact" w:line="580" w:before="480" w:after="180"/>
         <w:jc w:val="center"/>
         <w:outlineLvl w:val="0"/>
-        <w:outlineLvl w:val="0"/>
       </w:pPr>
       <w:r>
         <w:rPr>
@@ -12149,9 +12112,9 @@
     <w:tbl>
       <w:tblPr>
         <w:tblStyle w:val="TableGrid"/>
+        <w:bidiVisual/>
         <w:tblW w:type="auto" w:w="0"/>
         <w:tblLook w:firstColumn="1" w:firstRow="1" w:lastColumn="0" w:lastRow="0" w:noHBand="0" w:noVBand="1" w:val="04A0"/>
-        <w:bidiVisual/>
       </w:tblPr>
       <w:tblGrid>
         <w:gridCol w:w="1644"/>
@@ -13487,12 +13450,12 @@
         <w:sectPr>
           <w:footerReference w:type="default" r:id="rId22"/>
           <w:footnotePr>
-            <w:numFmt w:val="hindi"/>
+            <w:numFmt w:val="decimal"/>
             <w:numRestart w:val="eachPage"/>
           </w:footnotePr>
           <w:pgSz w:w="11906" w:h="16838"/>
           <w:pgMar w:top="1701" w:right="2268" w:bottom="1417" w:left="1417" w:header="720" w:footer="567" w:gutter="0"/>
-          <w:pgNumType w:fmt="hindi"/>
+          <w:pgNumType w:fmt="decimal"/>
           <w:cols w:space="720"/>
           <w:titlePg/>
           <w:bidi/>
@@ -13772,13 +13735,13 @@
     </w:p>
     <w:tbl>
       <w:tblPr>
+        <w:bidiVisual/>
         <w:tblW w:type="auto" w:w="0"/>
-        <w:tblLook w:firstColumn="1" w:firstRow="1" w:lastColumn="0" w:lastRow="0" w:noHBand="0" w:noVBand="1" w:val="04A0"/>
         <w:tblBorders>
           <w:top w:val="single" w:sz="12" w:space="0" w:color="000000"/>
           <w:bottom w:val="single" w:sz="12" w:space="0" w:color="000000"/>
         </w:tblBorders>
-        <w:bidiVisual/>
+        <w:tblLook w:firstColumn="1" w:firstRow="1" w:lastColumn="0" w:lastRow="0" w:noHBand="0" w:noVBand="1" w:val="04A0"/>
       </w:tblPr>
       <w:tblGrid>
         <w:gridCol w:w="2740"/>
@@ -14533,13 +14496,13 @@
     </w:p>
     <w:tbl>
       <w:tblPr>
+        <w:bidiVisual/>
         <w:tblW w:type="auto" w:w="0"/>
-        <w:tblLook w:firstColumn="1" w:firstRow="1" w:lastColumn="0" w:lastRow="0" w:noHBand="0" w:noVBand="1" w:val="04A0"/>
         <w:tblBorders>
           <w:top w:val="single" w:sz="12" w:space="0" w:color="000000"/>
           <w:bottom w:val="single" w:sz="12" w:space="0" w:color="000000"/>
         </w:tblBorders>
-        <w:bidiVisual/>
+        <w:tblLook w:firstColumn="1" w:firstRow="1" w:lastColumn="0" w:lastRow="0" w:noHBand="0" w:noVBand="1" w:val="04A0"/>
       </w:tblPr>
       <w:tblGrid>
         <w:gridCol w:w="2055"/>
@@ -16486,13 +16449,13 @@
     </w:p>
     <w:tbl>
       <w:tblPr>
+        <w:bidiVisual/>
         <w:tblW w:type="auto" w:w="0"/>
-        <w:tblLook w:firstColumn="1" w:firstRow="1" w:lastColumn="0" w:lastRow="0" w:noHBand="0" w:noVBand="1" w:val="04A0"/>
         <w:tblBorders>
           <w:top w:val="single" w:sz="12" w:space="0" w:color="000000"/>
           <w:bottom w:val="single" w:sz="12" w:space="0" w:color="000000"/>
         </w:tblBorders>
-        <w:bidiVisual/>
+        <w:tblLook w:firstColumn="1" w:firstRow="1" w:lastColumn="0" w:lastRow="0" w:noHBand="0" w:noVBand="1" w:val="04A0"/>
       </w:tblPr>
       <w:tblGrid>
         <w:gridCol w:w="2055"/>
@@ -18373,13 +18336,13 @@
     </w:p>
     <w:tbl>
       <w:tblPr>
+        <w:bidiVisual/>
         <w:tblW w:type="auto" w:w="0"/>
-        <w:tblLook w:firstColumn="1" w:firstRow="1" w:lastColumn="0" w:lastRow="0" w:noHBand="0" w:noVBand="1" w:val="04A0"/>
         <w:tblBorders>
           <w:top w:val="single" w:sz="12" w:space="0" w:color="000000"/>
           <w:bottom w:val="single" w:sz="12" w:space="0" w:color="000000"/>
         </w:tblBorders>
-        <w:bidiVisual/>
+        <w:tblLook w:firstColumn="1" w:firstRow="1" w:lastColumn="0" w:lastRow="0" w:noHBand="0" w:noVBand="1" w:val="04A0"/>
       </w:tblPr>
       <w:tblGrid>
         <w:gridCol w:w="913"/>
@@ -19341,13 +19304,13 @@
     </w:p>
     <w:tbl>
       <w:tblPr>
+        <w:bidiVisual/>
         <w:tblW w:type="auto" w:w="0"/>
-        <w:tblLook w:firstColumn="1" w:firstRow="1" w:lastColumn="0" w:lastRow="0" w:noHBand="0" w:noVBand="1" w:val="04A0"/>
         <w:tblBorders>
           <w:top w:val="single" w:sz="12" w:space="0" w:color="000000"/>
           <w:bottom w:val="single" w:sz="12" w:space="0" w:color="000000"/>
         </w:tblBorders>
-        <w:bidiVisual/>
+        <w:tblLook w:firstColumn="1" w:firstRow="1" w:lastColumn="0" w:lastRow="0" w:noHBand="0" w:noVBand="1" w:val="04A0"/>
       </w:tblPr>
       <w:tblGrid>
         <w:gridCol w:w="2740"/>
@@ -20858,13 +20821,13 @@
     </w:p>
     <w:tbl>
       <w:tblPr>
+        <w:bidiVisual/>
         <w:tblW w:type="auto" w:w="0"/>
-        <w:tblLook w:firstColumn="1" w:firstRow="1" w:lastColumn="0" w:lastRow="0" w:noHBand="0" w:noVBand="1" w:val="04A0"/>
         <w:tblBorders>
           <w:top w:val="single" w:sz="12" w:space="0" w:color="000000"/>
           <w:bottom w:val="single" w:sz="12" w:space="0" w:color="000000"/>
         </w:tblBorders>
-        <w:bidiVisual/>
+        <w:tblLook w:firstColumn="1" w:firstRow="1" w:lastColumn="0" w:lastRow="0" w:noHBand="0" w:noVBand="1" w:val="04A0"/>
       </w:tblPr>
       <w:tblGrid>
         <w:gridCol w:w="2055"/>
@@ -21600,13 +21563,13 @@
     </w:p>
     <w:tbl>
       <w:tblPr>
+        <w:bidiVisual/>
         <w:tblW w:type="auto" w:w="0"/>
-        <w:tblLook w:firstColumn="1" w:firstRow="1" w:lastColumn="0" w:lastRow="0" w:noHBand="0" w:noVBand="1" w:val="04A0"/>
         <w:tblBorders>
           <w:top w:val="single" w:sz="12" w:space="0" w:color="000000"/>
           <w:bottom w:val="single" w:sz="12" w:space="0" w:color="000000"/>
         </w:tblBorders>
-        <w:bidiVisual/>
+        <w:tblLook w:firstColumn="1" w:firstRow="1" w:lastColumn="0" w:lastRow="0" w:noHBand="0" w:noVBand="1" w:val="04A0"/>
       </w:tblPr>
       <w:tblGrid>
         <w:gridCol w:w="1370"/>
@@ -23052,13 +23015,13 @@
     </w:p>
     <w:tbl>
       <w:tblPr>
+        <w:bidiVisual/>
         <w:tblW w:type="auto" w:w="0"/>
-        <w:tblLook w:firstColumn="1" w:firstRow="1" w:lastColumn="0" w:lastRow="0" w:noHBand="0" w:noVBand="1" w:val="04A0"/>
         <w:tblBorders>
           <w:top w:val="single" w:sz="12" w:space="0" w:color="000000"/>
           <w:bottom w:val="single" w:sz="12" w:space="0" w:color="000000"/>
         </w:tblBorders>
-        <w:bidiVisual/>
+        <w:tblLook w:firstColumn="1" w:firstRow="1" w:lastColumn="0" w:lastRow="0" w:noHBand="0" w:noVBand="1" w:val="04A0"/>
       </w:tblPr>
       <w:tblGrid>
         <w:gridCol w:w="4110"/>
@@ -23682,13 +23645,13 @@
     </w:p>
     <w:tbl>
       <w:tblPr>
+        <w:bidiVisual/>
         <w:tblW w:type="auto" w:w="0"/>
-        <w:tblLook w:firstColumn="1" w:firstRow="1" w:lastColumn="0" w:lastRow="0" w:noHBand="0" w:noVBand="1" w:val="04A0"/>
         <w:tblBorders>
           <w:top w:val="single" w:sz="12" w:space="0" w:color="000000"/>
           <w:bottom w:val="single" w:sz="12" w:space="0" w:color="000000"/>
         </w:tblBorders>
-        <w:bidiVisual/>
+        <w:tblLook w:firstColumn="1" w:firstRow="1" w:lastColumn="0" w:lastRow="0" w:noHBand="0" w:noVBand="1" w:val="04A0"/>
       </w:tblPr>
       <w:tblGrid>
         <w:gridCol w:w="2740"/>
@@ -24047,29 +24010,17 @@
         <w:t xml:space="preserve">در مجموع، هر چهار فرضیه پژوهش تأیید شدند. یافته‌ها نشان می‌دهند که اضطراب صفتی هم به‌طور مستقیم و هم به‌طور غیرمستقیم (از مسیر طرحواره‌های ناسازگار اولیه) با رفتارهای مالی پرخطر پیوند دارد و بخش معناداری از این پیوند از مسیر میانجی می‌گذرد. در تفسیر این یافته‌ها دو احتیاط لازم است: نخست، طرح پژوهش مقطعی است و هیچ‌یک از این روابط، رابطه علّی را اثبات نمی‌کنند؛ دوم، حجم نمونه نهایی (۱۸۵ نفر) از حداقل ۲۰۰ نفرِ مورد نیاز برای مدل‌سازی معادلات ساختاری کمتر است، از این رو نتایج بخش ۴-۹ جنبه تکمیلی و مقدماتی دارند و تعمیم آن‌ها نیازمند نمونه بزرگ‌تر است.</w:t>
       </w:r>
     </w:p>
-    <w:sectPr>
-      <w:footerReference w:type="default" r:id="rId9"/>
-      <w:footnotePr>
-        <w:numFmt w:val="hindi"/>
-        <w:numRestart w:val="eachPage"/>
-      </w:footnotePr>
-      <w:pgSz w:w="11906" w:h="16838"/>
-      <w:pgMar w:top="1701" w:right="2268" w:bottom="1417" w:left="1417" w:header="720" w:footer="567" w:gutter="0"/>
-      <w:cols w:space="720"/>
-      <w:bidi/>
-      <w:docGrid w:linePitch="360"/>
-    </w:sectPr>
     <w:p>
       <w:pPr>
         <w:sectPr>
           <w:footerReference w:type="default" r:id="rId22"/>
           <w:footnotePr>
-            <w:numFmt w:val="hindi"/>
+            <w:numFmt w:val="decimal"/>
             <w:numRestart w:val="eachPage"/>
           </w:footnotePr>
           <w:pgSz w:w="11906" w:h="16838"/>
           <w:pgMar w:top="1701" w:right="2268" w:bottom="1417" w:left="1417" w:header="720" w:footer="567" w:gutter="0"/>
-          <w:pgNumType w:fmt="hindi"/>
+          <w:pgNumType w:fmt="decimal"/>
           <w:cols w:space="720"/>
           <w:titlePg/>
           <w:bidi/>
@@ -25022,9 +24973,9 @@
     <w:p>
       <w:pPr>
         <w:bidi/>
+        <w:spacing w:line="580" w:lineRule="exact"/>
         <w:jc w:val="right"/>
         <w:outlineLvl w:val="0"/>
-        <w:spacing w:line="580" w:lineRule="exact"/>
       </w:pPr>
       <w:r>
         <w:rPr>
@@ -25041,8 +24992,8 @@
     <w:p>
       <w:pPr>
         <w:bidi/>
+        <w:spacing w:line="580" w:lineRule="exact"/>
         <w:jc w:val="right"/>
-        <w:spacing w:line="580" w:lineRule="exact"/>
       </w:pPr>
       <w:r>
         <w:rPr>
@@ -25059,8 +25010,24 @@
     <w:p>
       <w:pPr>
         <w:bidi/>
+        <w:spacing w:line="580" w:lineRule="exact" w:after="40"/>
         <w:jc w:val="right"/>
+      </w:pPr>
+      <w:r>
+        <w:rPr>
+          <w:rFonts w:ascii="B Nazanin" w:hAnsi="B Nazanin" w:cs="B Nazanin"/>
+          <w:sz w:val="24"/>
+          <w:szCs w:val="24"/>
+          <w:rtl/>
+        </w:rPr>
+        <w:t>امیدی، ع.، کدیور، پ.، و فرزاد، و. (۱۳۹۲). رابطه بین طرحواره‌های ناسازگار اولیه، سبک‌های فرزندپروری و سبک‌های هویت با گرایش به اعتیاد. اعتیاد پژوهی، ۷(۲۷)، ۹-۲۶.</w:t>
+      </w:r>
+    </w:p>
+    <w:p>
+      <w:pPr>
+        <w:bidi/>
         <w:spacing w:line="580" w:lineRule="exact" w:after="40"/>
+        <w:jc w:val="right"/>
       </w:pPr>
       <w:r>
         <w:rPr>
@@ -25069,14 +25036,30 @@
           <w:szCs w:val="24"/>
           <w:rtl/>
         </w:rPr>
-        <w:t>امیدی، ع.، کدیور، پ.، و فرزاد، و. (۱۳۹۲). رابطه بین طرحواره‌های ناسازگار اولیه، سبک‌های فرزندپروری و سبک‌های هویت با گرایش به اعتیاد. اعتیاد پژوهی، ۷(۲۷)، ۹-۲۶.</w:t>
+        <w:t>امیدی، ع.، کدیور، پ.، و فرزاد، و. (۱۳۹۲). رابطه بین طرحواره‌های ناسازگار اولیه، سبک‌های فرزندپروری و سبک‌های هویت با گرایش به اعتیاد. اعتیادپژوهی، ۷(۲۷)، ۹-۲۶.</w:t>
       </w:r>
     </w:p>
     <w:p>
       <w:pPr>
         <w:bidi/>
+        <w:spacing w:line="580" w:lineRule="exact" w:after="40"/>
         <w:jc w:val="right"/>
+      </w:pPr>
+      <w:r>
+        <w:rPr>
+          <w:rFonts w:ascii="B Nazanin" w:hAnsi="B Nazanin" w:cs="B Nazanin"/>
+          <w:sz w:val="24"/>
+          <w:szCs w:val="24"/>
+          <w:rtl/>
+        </w:rPr>
+        <w:t>بشارت، محمدعلی؛ رستمی، رضا؛ پورنقاش، سید عباس؛ و گراوند، فریبرز. (۱۳۹۵). بررسی ساختار عاملی و ویژگی‌های روان‌سنجی پرسشنامه اضطراب حالت-صفت اسپیلبرگر در نمونه‌ای از دانشجویان. فصلنامه اندازه‌گیری تربیتی، ۷(۲۵)، ۷۷-۹۸.</w:t>
+      </w:r>
+    </w:p>
+    <w:p>
+      <w:pPr>
+        <w:bidi/>
         <w:spacing w:line="580" w:lineRule="exact" w:after="40"/>
+        <w:jc w:val="right"/>
       </w:pPr>
       <w:r>
         <w:rPr>
@@ -25085,14 +25068,30 @@
           <w:szCs w:val="24"/>
           <w:rtl/>
         </w:rPr>
-        <w:t>امیدی، ع.، کدیور، پ.، و فرزاد، و. (۱۳۹۲). رابطه بین طرحواره‌های ناسازگار اولیه، سبک‌های فرزندپروری و سبک‌های هویت با گرایش به اعتیاد. اعتیادپژوهی، ۷(۲۷)، ۹-۲۶.</w:t>
+        <w:t>بهدیو، ع.، نمازی، م.، و خواجوی، ش. (۱۳۹۸). ارائه مدلی برای بررسی تأثیرات ترکیبی ریسک‌پذیری، ویژگی‌های فردی و فرهنگی بر بروز رفتار توده‌وار سرمایه‌گذاران در بورس اوراق بهادار تهران. پژوهش های حسابداری مالی و حسابرسی، ۱۱(۴۲)، ۱-۲۶.</w:t>
       </w:r>
     </w:p>
     <w:p>
       <w:pPr>
         <w:bidi/>
+        <w:spacing w:line="580" w:lineRule="exact" w:after="40"/>
         <w:jc w:val="right"/>
+      </w:pPr>
+      <w:r>
+        <w:rPr>
+          <w:rFonts w:ascii="B Nazanin" w:hAnsi="B Nazanin" w:cs="B Nazanin"/>
+          <w:sz w:val="24"/>
+          <w:szCs w:val="24"/>
+          <w:rtl/>
+        </w:rPr>
+        <w:t>ستایش، م. ح.، کاظم‌پور، م.، و دلالی اصفهانی، ر. (۱۳۹۹). بررسی نقش منابع اطلاعاتی بر رابطه میان ویژگی‌های شخصیتی و رفتار معاملاتی سرمایه‌گذاران حقیقی در بورس اوراق بهادار تهران. مطالعات مدیریت مالی، ۸(۱۶)، ۲۹-۶۱.</w:t>
+      </w:r>
+    </w:p>
+    <w:p>
+      <w:pPr>
+        <w:bidi/>
         <w:spacing w:line="580" w:lineRule="exact" w:after="40"/>
+        <w:jc w:val="right"/>
       </w:pPr>
       <w:r>
         <w:rPr>
@@ -25101,14 +25100,30 @@
           <w:szCs w:val="24"/>
           <w:rtl/>
         </w:rPr>
-        <w:t>بشارت، محمدعلی؛ رستمی، رضا؛ پورنقاش، سید عباس؛ و گراوند، فریبرز. (۱۳۹۵). بررسی ساختار عاملی و ویژگی‌های روان‌سنجی پرسشنامه اضطراب حالت-صفت اسپیلبرگر در نمونه‌ای از دانشجویان. فصلنامه اندازه‌گیری تربیتی، ۷(۲۵)، ۷۷-۹۸.</w:t>
+        <w:t>طالبی، محمد؛ یحیی‌زاده‌فر، محمود؛ و سعیدی، پرویز. (۱۳۹۸). اعتباریابی مقیاس تحمل ریسک مالی گرابل و لایتون در بورس اوراق بهادار تهران. فصلنامه علمی-پژوهشی دانش سرمایه‌گذاری، ۸(۳۱)، ۱۵۱-۱۶۸.</w:t>
       </w:r>
     </w:p>
     <w:p>
       <w:pPr>
         <w:bidi/>
+        <w:spacing w:line="580" w:lineRule="exact" w:after="40"/>
         <w:jc w:val="right"/>
+      </w:pPr>
+      <w:r>
+        <w:rPr>
+          <w:rFonts w:ascii="B Nazanin" w:hAnsi="B Nazanin" w:cs="B Nazanin"/>
+          <w:sz w:val="24"/>
+          <w:szCs w:val="24"/>
+          <w:rtl/>
+        </w:rPr>
+        <w:t>فروغی، د.، و تهرانی، ر. (۱۳۹۷). نقش سواد مالی در تعدیل رابطه بین سوگیری های رفتاری و عملکرد سرمایه گذاری در بورس اوراق بهادار تهران. تحقیقات مالی، ۲۰) ۲(، ۱۸۹-۲۰۸.</w:t>
+      </w:r>
+    </w:p>
+    <w:p>
+      <w:pPr>
+        <w:bidi/>
         <w:spacing w:line="580" w:lineRule="exact" w:after="40"/>
+        <w:jc w:val="right"/>
       </w:pPr>
       <w:r>
         <w:rPr>
@@ -25117,14 +25132,30 @@
           <w:szCs w:val="24"/>
           <w:rtl/>
         </w:rPr>
-        <w:t>بهدیو، ع.، نمازی، م.، و خواجوی، ش. (۱۳۹۸). ارائه مدلی برای بررسی تأثیرات ترکیبی ریسک‌پذیری، ویژگی‌های فردی و فرهنگی بر بروز رفتار توده‌وار سرمایه‌گذاران در بورس اوراق بهادار تهران. پژوهش های حسابداری مالی و حسابرسی، ۱۱(۴۲)، ۱-۲۶.</w:t>
+        <w:t>فروغی، د.، و تهرانی، ر. (۱۳۹۷). نقش سواد مالی در تعدیل رابطه بین سوگیری های رفتاری و عملکرد سرمایه گذاری در بورس اوراق بهادار تهران. تحقیقات مالی، ۲۰(۲)، ۱۸۹-۲۰۸.</w:t>
       </w:r>
     </w:p>
     <w:p>
       <w:pPr>
         <w:bidi/>
+        <w:spacing w:line="580" w:lineRule="exact" w:after="40"/>
         <w:jc w:val="right"/>
+      </w:pPr>
+      <w:r>
+        <w:rPr>
+          <w:rFonts w:ascii="B Nazanin" w:hAnsi="B Nazanin" w:cs="B Nazanin"/>
+          <w:sz w:val="24"/>
+          <w:szCs w:val="24"/>
+          <w:rtl/>
+        </w:rPr>
+        <w:t>فلاح، م.، و خدایی، ا. (۱۳۹۸). رابطه هوش هیجانی و سبک های تصمیم گیری با عملکرد سرمایه گذاری در بورس اوراق بهادار تهران. فصلنامه علمی پژوهشی دانش مالی تحلیل اوراق بهادار، ۱۲) ۴۲(، ۱-۱۶.</w:t>
+      </w:r>
+    </w:p>
+    <w:p>
+      <w:pPr>
+        <w:bidi/>
         <w:spacing w:line="580" w:lineRule="exact" w:after="40"/>
+        <w:jc w:val="right"/>
       </w:pPr>
       <w:r>
         <w:rPr>
@@ -25133,14 +25164,30 @@
           <w:szCs w:val="24"/>
           <w:rtl/>
         </w:rPr>
-        <w:t>ستایش، م. ح.، کاظم‌پور، م.، و دلالی اصفهانی، ر. (۱۳۹۹). بررسی نقش منابع اطلاعاتی بر رابطه میان ویژگی‌های شخصیتی و رفتار معاملاتی سرمایه‌گذاران حقیقی در بورس اوراق بهادار تهران. مطالعات مدیریت مالی، ۸(۱۶)، ۲۹-۶۱.</w:t>
+        <w:t>فلاح، م.، و خدایی، ا. (۱۳۹۸). رابطه هوش هیجانی و سبک های تصمیم گیری با عملکرد سرمایه گذاری در بورس اوراق بهادار تهران. فصلنامه علمی-پژوهشی دانش مالی تحلیل اوراق بهادار، ۱۲(۴۲)، ۱-۱۶.</w:t>
       </w:r>
     </w:p>
     <w:p>
       <w:pPr>
         <w:bidi/>
+        <w:spacing w:line="580" w:lineRule="exact" w:after="40"/>
         <w:jc w:val="right"/>
+      </w:pPr>
+      <w:r>
+        <w:rPr>
+          <w:rFonts w:ascii="B Nazanin" w:hAnsi="B Nazanin" w:cs="B Nazanin"/>
+          <w:sz w:val="24"/>
+          <w:szCs w:val="24"/>
+          <w:rtl/>
+        </w:rPr>
+        <w:t>نوری، ر.، و هاشمیان، ک. (۱۳۹۶). رابطه بین طرحواره های ناسازگار اولیه و اضطراب اجتماعی در دانشجویان. مطالعات روانشناختی، ۱۳(۲)، ۱۴۱-۱۵۸.</w:t>
+      </w:r>
+    </w:p>
+    <w:p>
+      <w:pPr>
+        <w:bidi/>
         <w:spacing w:line="580" w:lineRule="exact" w:after="40"/>
+        <w:jc w:val="right"/>
       </w:pPr>
       <w:r>
         <w:rPr>
@@ -25149,110 +25196,14 @@
           <w:szCs w:val="24"/>
           <w:rtl/>
         </w:rPr>
-        <w:t>طالبی، محمد؛ یحیی‌زاده‌فر، محمود؛ و سعیدی، پرویز. (۱۳۹۸). اعتباریابی مقیاس تحمل ریسک مالی گرابل و لایتون در بورس اوراق بهادار تهران. فصلنامه علمی-پژوهشی دانش سرمایه‌گذاری، ۸(۳۱)، ۱۵۱-۱۶۸.</w:t>
+        <w:t>یوسفی، ناصر. (۱۳۹۶). ویژگی‌های روان‌سنجی نسخه فارسی پرسشنامه طرحواره یانگ (فرم کوتاه) در نمونه غیربالینی. مجله روانشناسی بالینی، ۹(۲)، ۹۱-۱۰۲.</w:t>
       </w:r>
     </w:p>
     <w:p>
       <w:pPr>
         <w:bidi/>
+        <w:spacing w:line="580" w:lineRule="exact"/>
         <w:jc w:val="right"/>
-        <w:spacing w:line="580" w:lineRule="exact" w:after="40"/>
-      </w:pPr>
-      <w:r>
-        <w:rPr>
-          <w:rFonts w:ascii="B Nazanin" w:hAnsi="B Nazanin" w:cs="B Nazanin"/>
-          <w:sz w:val="24"/>
-          <w:szCs w:val="24"/>
-          <w:rtl/>
-        </w:rPr>
-        <w:t>فروغی، د.، و تهرانی، ر. (۱۳۹۷). نقش سواد مالی در تعدیل رابطه بین سوگیری های رفتاری و عملکرد سرمایه گذاری در بورس اوراق بهادار تهران. تحقیقات مالی، ۲۰) ۲(، ۱۸۹-۲۰۸.</w:t>
-      </w:r>
-    </w:p>
-    <w:p>
-      <w:pPr>
-        <w:bidi/>
-        <w:jc w:val="right"/>
-        <w:spacing w:line="580" w:lineRule="exact" w:after="40"/>
-      </w:pPr>
-      <w:r>
-        <w:rPr>
-          <w:rFonts w:ascii="B Nazanin" w:hAnsi="B Nazanin" w:cs="B Nazanin"/>
-          <w:sz w:val="24"/>
-          <w:szCs w:val="24"/>
-          <w:rtl/>
-        </w:rPr>
-        <w:t>فروغی، د.، و تهرانی، ر. (۱۳۹۷). نقش سواد مالی در تعدیل رابطه بین سوگیری های رفتاری و عملکرد سرمایه گذاری در بورس اوراق بهادار تهران. تحقیقات مالی، ۲۰(۲)، ۱۸۹-۲۰۸.</w:t>
-      </w:r>
-    </w:p>
-    <w:p>
-      <w:pPr>
-        <w:bidi/>
-        <w:jc w:val="right"/>
-        <w:spacing w:line="580" w:lineRule="exact" w:after="40"/>
-      </w:pPr>
-      <w:r>
-        <w:rPr>
-          <w:rFonts w:ascii="B Nazanin" w:hAnsi="B Nazanin" w:cs="B Nazanin"/>
-          <w:sz w:val="24"/>
-          <w:szCs w:val="24"/>
-          <w:rtl/>
-        </w:rPr>
-        <w:t>فلاح، م.، و خدایی، ا. (۱۳۹۸). رابطه هوش هیجانی و سبک های تصمیم گیری با عملکرد سرمایه گذاری در بورس اوراق بهادار تهران. فصلنامه علمی پژوهشی دانش مالی تحلیل اوراق بهادار، ۱۲) ۴۲(، ۱-۱۶.</w:t>
-      </w:r>
-    </w:p>
-    <w:p>
-      <w:pPr>
-        <w:bidi/>
-        <w:jc w:val="right"/>
-        <w:spacing w:line="580" w:lineRule="exact" w:after="40"/>
-      </w:pPr>
-      <w:r>
-        <w:rPr>
-          <w:rFonts w:ascii="B Nazanin" w:hAnsi="B Nazanin" w:cs="B Nazanin"/>
-          <w:sz w:val="24"/>
-          <w:szCs w:val="24"/>
-          <w:rtl/>
-        </w:rPr>
-        <w:t>فلاح، م.، و خدایی، ا. (۱۳۹۸). رابطه هوش هیجانی و سبک های تصمیم گیری با عملکرد سرمایه گذاری در بورس اوراق بهادار تهران. فصلنامه علمی-پژوهشی دانش مالی تحلیل اوراق بهادار، ۱۲(۴۲)، ۱-۱۶.</w:t>
-      </w:r>
-    </w:p>
-    <w:p>
-      <w:pPr>
-        <w:bidi/>
-        <w:jc w:val="right"/>
-        <w:spacing w:line="580" w:lineRule="exact" w:after="40"/>
-      </w:pPr>
-      <w:r>
-        <w:rPr>
-          <w:rFonts w:ascii="B Nazanin" w:hAnsi="B Nazanin" w:cs="B Nazanin"/>
-          <w:sz w:val="24"/>
-          <w:szCs w:val="24"/>
-          <w:rtl/>
-        </w:rPr>
-        <w:t>نوری، ر.، و هاشمیان، ک. (۱۳۹۶). رابطه بین طرحواره های ناسازگار اولیه و اضطراب اجتماعی در دانشجویان. مطالعات روانشناختی، ۱۳(۲)، ۱۴۱-۱۵۸.</w:t>
-      </w:r>
-    </w:p>
-    <w:p>
-      <w:pPr>
-        <w:bidi/>
-        <w:jc w:val="right"/>
-        <w:spacing w:line="580" w:lineRule="exact" w:after="40"/>
-      </w:pPr>
-      <w:r>
-        <w:rPr>
-          <w:rFonts w:ascii="B Nazanin" w:hAnsi="B Nazanin" w:cs="B Nazanin"/>
-          <w:sz w:val="24"/>
-          <w:szCs w:val="24"/>
-          <w:rtl/>
-        </w:rPr>
-        <w:t>یوسفی، ناصر. (۱۳۹۶). ویژگی‌های روان‌سنجی نسخه فارسی پرسشنامه طرحواره یانگ (فرم کوتاه) در نمونه غیربالینی. مجله روانشناسی بالینی، ۹(۲)، ۹۱-۱۰۲.</w:t>
-      </w:r>
-    </w:p>
-    <w:p>
-      <w:pPr>
-        <w:bidi/>
-        <w:jc w:val="right"/>
-        <w:spacing w:line="580" w:lineRule="exact"/>
       </w:pPr>
       <w:r>
         <w:rPr>
@@ -25269,9 +25220,9 @@
     <w:p>
       <w:pPr>
         <w:bidi/>
-        <w:jc w:val="left"/>
         <w:spacing w:line="580" w:lineRule="exact" w:after="40"/>
         <w:ind w:left="720" w:hanging="720"/>
+        <w:jc w:val="left"/>
       </w:pPr>
       <w:r>
         <w:rPr>
@@ -25285,9 +25236,9 @@
     <w:p>
       <w:pPr>
         <w:bidi/>
-        <w:jc w:val="left"/>
         <w:spacing w:line="580" w:lineRule="exact" w:after="40"/>
         <w:ind w:left="720" w:hanging="720"/>
+        <w:jc w:val="left"/>
       </w:pPr>
       <w:r>
         <w:rPr>
@@ -25301,9 +25252,9 @@
     <w:p>
       <w:pPr>
         <w:bidi/>
-        <w:jc w:val="left"/>
         <w:spacing w:line="580" w:lineRule="exact" w:after="40"/>
         <w:ind w:left="720" w:hanging="720"/>
+        <w:jc w:val="left"/>
       </w:pPr>
       <w:r>
         <w:rPr>
@@ -25317,9 +25268,9 @@
     <w:p>
       <w:pPr>
         <w:bidi/>
-        <w:jc w:val="left"/>
         <w:spacing w:line="580" w:lineRule="exact" w:after="40"/>
         <w:ind w:left="720" w:hanging="720"/>
+        <w:jc w:val="left"/>
       </w:pPr>
       <w:r>
         <w:rPr>
@@ -25333,9 +25284,9 @@
     <w:p>
       <w:pPr>
         <w:bidi/>
-        <w:jc w:val="left"/>
         <w:spacing w:line="580" w:lineRule="exact" w:after="40"/>
         <w:ind w:left="720" w:hanging="720"/>
+        <w:jc w:val="left"/>
       </w:pPr>
       <w:r>
         <w:rPr>
@@ -25349,9 +25300,9 @@
     <w:p>
       <w:pPr>
         <w:bidi/>
-        <w:jc w:val="left"/>
         <w:spacing w:line="580" w:lineRule="exact" w:after="40"/>
         <w:ind w:left="720" w:hanging="720"/>
+        <w:jc w:val="left"/>
       </w:pPr>
       <w:r>
         <w:rPr>
@@ -25365,9 +25316,9 @@
     <w:p>
       <w:pPr>
         <w:bidi/>
-        <w:jc w:val="left"/>
         <w:spacing w:line="580" w:lineRule="exact" w:after="40"/>
         <w:ind w:left="720" w:hanging="720"/>
+        <w:jc w:val="left"/>
       </w:pPr>
       <w:r>
         <w:rPr>
@@ -25381,9 +25332,9 @@
     <w:p>
       <w:pPr>
         <w:bidi/>
-        <w:jc w:val="left"/>
         <w:spacing w:line="580" w:lineRule="exact" w:after="40"/>
         <w:ind w:left="720" w:hanging="720"/>
+        <w:jc w:val="left"/>
       </w:pPr>
       <w:r>
         <w:rPr>
@@ -25397,9 +25348,9 @@
     <w:p>
       <w:pPr>
         <w:bidi/>
-        <w:jc w:val="left"/>
         <w:spacing w:line="580" w:lineRule="exact" w:after="40"/>
         <w:ind w:left="720" w:hanging="720"/>
+        <w:jc w:val="left"/>
       </w:pPr>
       <w:r>
         <w:rPr>
@@ -25413,9 +25364,9 @@
     <w:p>
       <w:pPr>
         <w:bidi/>
-        <w:jc w:val="left"/>
         <w:spacing w:line="580" w:lineRule="exact" w:after="40"/>
         <w:ind w:left="720" w:hanging="720"/>
+        <w:jc w:val="left"/>
       </w:pPr>
       <w:r>
         <w:rPr>
@@ -25429,9 +25380,9 @@
     <w:p>
       <w:pPr>
         <w:bidi/>
-        <w:jc w:val="left"/>
         <w:spacing w:line="580" w:lineRule="exact" w:after="40"/>
         <w:ind w:left="720" w:hanging="720"/>
+        <w:jc w:val="left"/>
       </w:pPr>
       <w:r>
         <w:rPr>
@@ -25445,9 +25396,9 @@
     <w:p>
       <w:pPr>
         <w:bidi/>
-        <w:jc w:val="left"/>
         <w:spacing w:line="580" w:lineRule="exact" w:after="40"/>
         <w:ind w:left="720" w:hanging="720"/>
+        <w:jc w:val="left"/>
       </w:pPr>
       <w:r>
         <w:rPr>
@@ -25461,9 +25412,9 @@
     <w:p>
       <w:pPr>
         <w:bidi/>
-        <w:jc w:val="left"/>
         <w:spacing w:line="580" w:lineRule="exact" w:after="40"/>
         <w:ind w:left="720" w:hanging="720"/>
+        <w:jc w:val="left"/>
       </w:pPr>
       <w:r>
         <w:rPr>
@@ -25477,9 +25428,9 @@
     <w:p>
       <w:pPr>
         <w:bidi/>
-        <w:jc w:val="left"/>
         <w:spacing w:line="580" w:lineRule="exact" w:after="40"/>
         <w:ind w:left="720" w:hanging="720"/>
+        <w:jc w:val="left"/>
       </w:pPr>
       <w:r>
         <w:rPr>
@@ -25493,9 +25444,9 @@
     <w:p>
       <w:pPr>
         <w:bidi/>
-        <w:jc w:val="left"/>
         <w:spacing w:line="580" w:lineRule="exact" w:after="40"/>
         <w:ind w:left="720" w:hanging="720"/>
+        <w:jc w:val="left"/>
       </w:pPr>
       <w:r>
         <w:rPr>
@@ -25509,9 +25460,9 @@
     <w:p>
       <w:pPr>
         <w:bidi/>
-        <w:jc w:val="left"/>
         <w:spacing w:line="580" w:lineRule="exact" w:after="40"/>
         <w:ind w:left="720" w:hanging="720"/>
+        <w:jc w:val="left"/>
       </w:pPr>
       <w:r>
         <w:rPr>
@@ -25525,9 +25476,9 @@
     <w:p>
       <w:pPr>
         <w:bidi/>
-        <w:jc w:val="left"/>
         <w:spacing w:line="580" w:lineRule="exact" w:after="40"/>
         <w:ind w:left="720" w:hanging="720"/>
+        <w:jc w:val="left"/>
       </w:pPr>
       <w:r>
         <w:rPr>
@@ -25541,9 +25492,9 @@
     <w:p>
       <w:pPr>
         <w:bidi/>
-        <w:jc w:val="left"/>
         <w:spacing w:line="580" w:lineRule="exact" w:after="40"/>
         <w:ind w:left="720" w:hanging="720"/>
+        <w:jc w:val="left"/>
       </w:pPr>
       <w:r>
         <w:rPr>
@@ -25557,9 +25508,9 @@
     <w:p>
       <w:pPr>
         <w:bidi/>
-        <w:jc w:val="left"/>
         <w:spacing w:line="580" w:lineRule="exact" w:after="40"/>
         <w:ind w:left="720" w:hanging="720"/>
+        <w:jc w:val="left"/>
       </w:pPr>
       <w:r>
         <w:rPr>
@@ -25573,9 +25524,9 @@
     <w:p>
       <w:pPr>
         <w:bidi/>
-        <w:jc w:val="left"/>
         <w:spacing w:line="580" w:lineRule="exact" w:after="40"/>
         <w:ind w:left="720" w:hanging="720"/>
+        <w:jc w:val="left"/>
       </w:pPr>
       <w:r>
         <w:rPr>
@@ -25589,9 +25540,9 @@
     <w:p>
       <w:pPr>
         <w:bidi/>
-        <w:jc w:val="left"/>
         <w:spacing w:line="580" w:lineRule="exact" w:after="40"/>
         <w:ind w:left="720" w:hanging="720"/>
+        <w:jc w:val="left"/>
       </w:pPr>
       <w:r>
         <w:rPr>
@@ -25605,9 +25556,9 @@
     <w:p>
       <w:pPr>
         <w:bidi/>
-        <w:jc w:val="left"/>
         <w:spacing w:line="580" w:lineRule="exact" w:after="40"/>
         <w:ind w:left="720" w:hanging="720"/>
+        <w:jc w:val="left"/>
       </w:pPr>
       <w:r>
         <w:rPr>
@@ -25621,9 +25572,9 @@
     <w:p>
       <w:pPr>
         <w:bidi/>
-        <w:jc w:val="left"/>
         <w:spacing w:line="580" w:lineRule="exact" w:after="40"/>
         <w:ind w:left="720" w:hanging="720"/>
+        <w:jc w:val="left"/>
       </w:pPr>
       <w:r>
         <w:rPr>
@@ -25637,9 +25588,9 @@
     <w:p>
       <w:pPr>
         <w:bidi/>
-        <w:jc w:val="left"/>
         <w:spacing w:line="580" w:lineRule="exact" w:after="40"/>
         <w:ind w:left="720" w:hanging="720"/>
+        <w:jc w:val="left"/>
       </w:pPr>
       <w:r>
         <w:rPr>
@@ -25653,9 +25604,9 @@
     <w:p>
       <w:pPr>
         <w:bidi/>
-        <w:jc w:val="left"/>
         <w:spacing w:line="580" w:lineRule="exact" w:after="40"/>
         <w:ind w:left="720" w:hanging="720"/>
+        <w:jc w:val="left"/>
       </w:pPr>
       <w:r>
         <w:rPr>
@@ -25669,9 +25620,9 @@
     <w:p>
       <w:pPr>
         <w:bidi/>
-        <w:jc w:val="left"/>
         <w:spacing w:line="580" w:lineRule="exact" w:after="40"/>
         <w:ind w:left="720" w:hanging="720"/>
+        <w:jc w:val="left"/>
       </w:pPr>
       <w:r>
         <w:rPr>
@@ -25685,9 +25636,9 @@
     <w:p>
       <w:pPr>
         <w:bidi/>
-        <w:jc w:val="left"/>
         <w:spacing w:line="580" w:lineRule="exact" w:after="40"/>
         <w:ind w:left="720" w:hanging="720"/>
+        <w:jc w:val="left"/>
       </w:pPr>
       <w:r>
         <w:rPr>
@@ -25701,9 +25652,9 @@
     <w:p>
       <w:pPr>
         <w:bidi/>
-        <w:jc w:val="left"/>
         <w:spacing w:line="580" w:lineRule="exact" w:after="40"/>
         <w:ind w:left="720" w:hanging="720"/>
+        <w:jc w:val="left"/>
       </w:pPr>
       <w:r>
         <w:rPr>
@@ -25717,9 +25668,9 @@
     <w:p>
       <w:pPr>
         <w:bidi/>
-        <w:jc w:val="left"/>
         <w:spacing w:line="580" w:lineRule="exact" w:after="40"/>
         <w:ind w:left="720" w:hanging="720"/>
+        <w:jc w:val="left"/>
       </w:pPr>
       <w:r>
         <w:rPr>
@@ -25733,9 +25684,9 @@
     <w:p>
       <w:pPr>
         <w:bidi/>
-        <w:jc w:val="left"/>
         <w:spacing w:line="580" w:lineRule="exact" w:after="40"/>
         <w:ind w:left="720" w:hanging="720"/>
+        <w:jc w:val="left"/>
       </w:pPr>
       <w:r>
         <w:rPr>
@@ -25749,9 +25700,9 @@
     <w:p>
       <w:pPr>
         <w:bidi/>
-        <w:jc w:val="left"/>
         <w:spacing w:line="580" w:lineRule="exact" w:after="40"/>
         <w:ind w:left="720" w:hanging="720"/>
+        <w:jc w:val="left"/>
       </w:pPr>
       <w:r>
         <w:rPr>
@@ -25765,9 +25716,9 @@
     <w:p>
       <w:pPr>
         <w:bidi/>
-        <w:jc w:val="left"/>
         <w:spacing w:line="580" w:lineRule="exact" w:after="40"/>
         <w:ind w:left="720" w:hanging="720"/>
+        <w:jc w:val="left"/>
       </w:pPr>
       <w:r>
         <w:rPr>
@@ -25781,9 +25732,9 @@
     <w:p>
       <w:pPr>
         <w:bidi/>
-        <w:jc w:val="left"/>
         <w:spacing w:line="580" w:lineRule="exact" w:after="40"/>
         <w:ind w:left="720" w:hanging="720"/>
+        <w:jc w:val="left"/>
       </w:pPr>
       <w:r>
         <w:rPr>
@@ -25797,9 +25748,9 @@
     <w:p>
       <w:pPr>
         <w:bidi/>
-        <w:jc w:val="left"/>
         <w:spacing w:line="580" w:lineRule="exact" w:after="40"/>
         <w:ind w:left="720" w:hanging="720"/>
+        <w:jc w:val="left"/>
       </w:pPr>
       <w:r>
         <w:rPr>
@@ -25813,9 +25764,9 @@
     <w:p>
       <w:pPr>
         <w:bidi/>
-        <w:jc w:val="left"/>
         <w:spacing w:line="580" w:lineRule="exact" w:after="40"/>
         <w:ind w:left="720" w:hanging="720"/>
+        <w:jc w:val="left"/>
       </w:pPr>
       <w:r>
         <w:rPr>
@@ -25829,9 +25780,9 @@
     <w:p>
       <w:pPr>
         <w:bidi/>
-        <w:jc w:val="left"/>
         <w:spacing w:line="580" w:lineRule="exact" w:after="40"/>
         <w:ind w:left="720" w:hanging="720"/>
+        <w:jc w:val="left"/>
       </w:pPr>
       <w:r>
         <w:rPr>
@@ -25845,9 +25796,9 @@
     <w:p>
       <w:pPr>
         <w:bidi/>
-        <w:jc w:val="left"/>
         <w:spacing w:line="580" w:lineRule="exact" w:after="40"/>
         <w:ind w:left="720" w:hanging="720"/>
+        <w:jc w:val="left"/>
       </w:pPr>
       <w:r>
         <w:rPr>
@@ -25861,9 +25812,9 @@
     <w:p>
       <w:pPr>
         <w:bidi/>
-        <w:jc w:val="left"/>
         <w:spacing w:line="580" w:lineRule="exact" w:after="40"/>
         <w:ind w:left="720" w:hanging="720"/>
+        <w:jc w:val="left"/>
       </w:pPr>
       <w:r>
         <w:rPr>
@@ -25877,9 +25828,9 @@
     <w:p>
       <w:pPr>
         <w:bidi/>
-        <w:jc w:val="left"/>
         <w:spacing w:line="580" w:lineRule="exact" w:after="40"/>
         <w:ind w:left="720" w:hanging="720"/>
+        <w:jc w:val="left"/>
       </w:pPr>
       <w:r>
         <w:rPr>
@@ -25893,9 +25844,9 @@
     <w:p>
       <w:pPr>
         <w:bidi/>
-        <w:jc w:val="left"/>
         <w:spacing w:line="580" w:lineRule="exact" w:after="40"/>
         <w:ind w:left="720" w:hanging="720"/>
+        <w:jc w:val="left"/>
       </w:pPr>
       <w:r>
         <w:rPr>
@@ -25909,9 +25860,9 @@
     <w:p>
       <w:pPr>
         <w:bidi/>
-        <w:jc w:val="left"/>
         <w:spacing w:line="580" w:lineRule="exact" w:after="40"/>
         <w:ind w:left="720" w:hanging="720"/>
+        <w:jc w:val="left"/>
       </w:pPr>
       <w:r>
         <w:rPr>
@@ -25925,9 +25876,9 @@
     <w:p>
       <w:pPr>
         <w:bidi/>
-        <w:jc w:val="left"/>
         <w:spacing w:line="580" w:lineRule="exact" w:after="40"/>
         <w:ind w:left="720" w:hanging="720"/>
+        <w:jc w:val="left"/>
       </w:pPr>
       <w:r>
         <w:rPr>
@@ -25941,9 +25892,9 @@
     <w:p>
       <w:pPr>
         <w:bidi/>
-        <w:jc w:val="left"/>
         <w:spacing w:line="580" w:lineRule="exact" w:after="40"/>
         <w:ind w:left="720" w:hanging="720"/>
+        <w:jc w:val="left"/>
       </w:pPr>
       <w:r>
         <w:rPr>
@@ -25957,9 +25908,9 @@
     <w:p>
       <w:pPr>
         <w:bidi/>
-        <w:jc w:val="left"/>
         <w:spacing w:line="580" w:lineRule="exact" w:after="40"/>
         <w:ind w:left="720" w:hanging="720"/>
+        <w:jc w:val="left"/>
       </w:pPr>
       <w:r>
         <w:rPr>
@@ -25973,9 +25924,9 @@
     <w:p>
       <w:pPr>
         <w:bidi/>
-        <w:jc w:val="left"/>
         <w:spacing w:line="580" w:lineRule="exact" w:after="40"/>
         <w:ind w:left="720" w:hanging="720"/>
+        <w:jc w:val="left"/>
       </w:pPr>
       <w:r>
         <w:rPr>
@@ -25989,9 +25940,9 @@
     <w:p>
       <w:pPr>
         <w:bidi/>
-        <w:jc w:val="left"/>
         <w:spacing w:line="580" w:lineRule="exact" w:after="40"/>
         <w:ind w:left="720" w:hanging="720"/>
+        <w:jc w:val="left"/>
       </w:pPr>
       <w:r>
         <w:rPr>
@@ -26005,9 +25956,9 @@
     <w:p>
       <w:pPr>
         <w:bidi/>
-        <w:jc w:val="left"/>
         <w:spacing w:line="580" w:lineRule="exact" w:after="40"/>
         <w:ind w:left="720" w:hanging="720"/>
+        <w:jc w:val="left"/>
       </w:pPr>
       <w:r>
         <w:rPr>
@@ -26021,9 +25972,9 @@
     <w:p>
       <w:pPr>
         <w:bidi/>
-        <w:jc w:val="left"/>
         <w:spacing w:line="580" w:lineRule="exact" w:after="40"/>
         <w:ind w:left="720" w:hanging="720"/>
+        <w:jc w:val="left"/>
       </w:pPr>
       <w:r>
         <w:rPr>
@@ -26037,9 +25988,9 @@
     <w:p>
       <w:pPr>
         <w:bidi/>
-        <w:jc w:val="left"/>
         <w:spacing w:line="580" w:lineRule="exact" w:after="40"/>
         <w:ind w:left="720" w:hanging="720"/>
+        <w:jc w:val="left"/>
       </w:pPr>
       <w:r>
         <w:rPr>
@@ -26053,9 +26004,9 @@
     <w:p>
       <w:pPr>
         <w:bidi/>
-        <w:jc w:val="left"/>
         <w:spacing w:line="580" w:lineRule="exact" w:after="40"/>
         <w:ind w:left="720" w:hanging="720"/>
+        <w:jc w:val="left"/>
       </w:pPr>
       <w:r>
         <w:rPr>
@@ -26069,9 +26020,9 @@
     <w:p>
       <w:pPr>
         <w:bidi/>
-        <w:jc w:val="left"/>
         <w:spacing w:line="580" w:lineRule="exact" w:after="40"/>
         <w:ind w:left="720" w:hanging="720"/>
+        <w:jc w:val="left"/>
       </w:pPr>
       <w:r>
         <w:rPr>
@@ -26085,9 +26036,9 @@
     <w:p>
       <w:pPr>
         <w:bidi/>
-        <w:jc w:val="left"/>
         <w:spacing w:line="580" w:lineRule="exact" w:after="40"/>
         <w:ind w:left="720" w:hanging="720"/>
+        <w:jc w:val="left"/>
       </w:pPr>
       <w:r>
         <w:rPr>
@@ -26101,9 +26052,9 @@
     <w:p>
       <w:pPr>
         <w:bidi/>
-        <w:jc w:val="left"/>
         <w:spacing w:line="580" w:lineRule="exact" w:after="40"/>
         <w:ind w:left="720" w:hanging="720"/>
+        <w:jc w:val="left"/>
       </w:pPr>
       <w:r>
         <w:rPr>
@@ -26117,9 +26068,9 @@
     <w:p>
       <w:pPr>
         <w:bidi/>
-        <w:jc w:val="left"/>
         <w:spacing w:line="580" w:lineRule="exact" w:after="40"/>
         <w:ind w:left="720" w:hanging="720"/>
+        <w:jc w:val="left"/>
       </w:pPr>
       <w:r>
         <w:rPr>
@@ -26133,9 +26084,9 @@
     <w:p>
       <w:pPr>
         <w:bidi/>
-        <w:jc w:val="left"/>
         <w:spacing w:line="580" w:lineRule="exact" w:after="40"/>
         <w:ind w:left="720" w:hanging="720"/>
+        <w:jc w:val="left"/>
       </w:pPr>
       <w:r>
         <w:rPr>
@@ -26149,9 +26100,9 @@
     <w:p>
       <w:pPr>
         <w:bidi/>
-        <w:jc w:val="left"/>
         <w:spacing w:line="580" w:lineRule="exact" w:after="40"/>
         <w:ind w:left="720" w:hanging="720"/>
+        <w:jc w:val="left"/>
       </w:pPr>
       <w:r>
         <w:rPr>
@@ -26165,9 +26116,9 @@
     <w:p>
       <w:pPr>
         <w:bidi/>
-        <w:jc w:val="left"/>
         <w:spacing w:line="580" w:lineRule="exact" w:after="40"/>
         <w:ind w:left="720" w:hanging="720"/>
+        <w:jc w:val="left"/>
       </w:pPr>
       <w:r>
         <w:rPr>
@@ -26181,9 +26132,9 @@
     <w:p>
       <w:pPr>
         <w:bidi/>
-        <w:jc w:val="left"/>
         <w:spacing w:line="580" w:lineRule="exact" w:after="40"/>
         <w:ind w:left="720" w:hanging="720"/>
+        <w:jc w:val="left"/>
       </w:pPr>
       <w:r>
         <w:rPr>
@@ -26197,9 +26148,9 @@
     <w:p>
       <w:pPr>
         <w:bidi/>
-        <w:jc w:val="left"/>
         <w:spacing w:line="580" w:lineRule="exact" w:after="40"/>
         <w:ind w:left="720" w:hanging="720"/>
+        <w:jc w:val="left"/>
       </w:pPr>
       <w:r>
         <w:rPr>
@@ -26213,9 +26164,9 @@
     <w:p>
       <w:pPr>
         <w:bidi/>
-        <w:jc w:val="left"/>
         <w:spacing w:line="580" w:lineRule="exact" w:after="40"/>
         <w:ind w:left="720" w:hanging="720"/>
+        <w:jc w:val="left"/>
       </w:pPr>
       <w:r>
         <w:rPr>
@@ -26229,9 +26180,9 @@
     <w:p>
       <w:pPr>
         <w:bidi/>
-        <w:jc w:val="left"/>
         <w:spacing w:line="580" w:lineRule="exact" w:after="40"/>
         <w:ind w:left="720" w:hanging="720"/>
+        <w:jc w:val="left"/>
       </w:pPr>
       <w:r>
         <w:rPr>
@@ -26245,9 +26196,9 @@
     <w:p>
       <w:pPr>
         <w:bidi/>
-        <w:jc w:val="left"/>
         <w:spacing w:line="580" w:lineRule="exact" w:after="40"/>
         <w:ind w:left="720" w:hanging="720"/>
+        <w:jc w:val="left"/>
       </w:pPr>
       <w:r>
         <w:rPr>
@@ -26261,9 +26212,9 @@
     <w:p>
       <w:pPr>
         <w:bidi/>
-        <w:jc w:val="left"/>
         <w:spacing w:line="580" w:lineRule="exact" w:after="40"/>
         <w:ind w:left="720" w:hanging="720"/>
+        <w:jc w:val="left"/>
       </w:pPr>
       <w:r>
         <w:rPr>
@@ -26277,9 +26228,9 @@
     <w:p>
       <w:pPr>
         <w:bidi/>
-        <w:jc w:val="left"/>
         <w:spacing w:line="580" w:lineRule="exact" w:after="40"/>
         <w:ind w:left="720" w:hanging="720"/>
+        <w:jc w:val="left"/>
       </w:pPr>
       <w:r>
         <w:rPr>
@@ -26293,9 +26244,9 @@
     <w:p>
       <w:pPr>
         <w:bidi/>
-        <w:jc w:val="left"/>
         <w:spacing w:line="580" w:lineRule="exact" w:after="40"/>
         <w:ind w:left="720" w:hanging="720"/>
+        <w:jc w:val="left"/>
       </w:pPr>
       <w:r>
         <w:rPr>
@@ -26309,9 +26260,9 @@
     <w:p>
       <w:pPr>
         <w:bidi/>
-        <w:jc w:val="left"/>
         <w:spacing w:line="580" w:lineRule="exact" w:after="40"/>
         <w:ind w:left="720" w:hanging="720"/>
+        <w:jc w:val="left"/>
       </w:pPr>
       <w:r>
         <w:rPr>
@@ -26325,9 +26276,9 @@
     <w:p>
       <w:pPr>
         <w:bidi/>
-        <w:jc w:val="left"/>
         <w:spacing w:line="580" w:lineRule="exact" w:after="40"/>
         <w:ind w:left="720" w:hanging="720"/>
+        <w:jc w:val="left"/>
       </w:pPr>
       <w:r>
         <w:rPr>
@@ -26341,9 +26292,9 @@
     <w:p>
       <w:pPr>
         <w:bidi/>
-        <w:jc w:val="left"/>
         <w:spacing w:line="580" w:lineRule="exact" w:after="40"/>
         <w:ind w:left="720" w:hanging="720"/>
+        <w:jc w:val="left"/>
       </w:pPr>
       <w:r>
         <w:rPr>
@@ -26357,9 +26308,9 @@
     <w:p>
       <w:pPr>
         <w:bidi/>
-        <w:jc w:val="left"/>
         <w:spacing w:line="580" w:lineRule="exact" w:after="40"/>
         <w:ind w:left="720" w:hanging="720"/>
+        <w:jc w:val="left"/>
       </w:pPr>
       <w:r>
         <w:rPr>
@@ -26373,9 +26324,9 @@
     <w:p>
       <w:pPr>
         <w:bidi/>
-        <w:jc w:val="left"/>
         <w:spacing w:line="580" w:lineRule="exact" w:after="40"/>
         <w:ind w:left="720" w:hanging="720"/>
+        <w:jc w:val="left"/>
       </w:pPr>
       <w:r>
         <w:rPr>
@@ -26389,12 +26340,12 @@
     <w:sectPr>
       <w:footerReference w:type="default" r:id="rId22"/>
       <w:footnotePr>
-        <w:numFmt w:val="hindi"/>
+        <w:numFmt w:val="decimal"/>
         <w:numRestart w:val="eachPage"/>
       </w:footnotePr>
       <w:pgSz w:w="11906" w:h="16838"/>
       <w:pgMar w:top="1701" w:right="2268" w:bottom="1417" w:left="1417" w:header="720" w:footer="567" w:gutter="0"/>
-      <w:pgNumType w:fmt="hindi"/>
+      <w:pgNumType w:fmt="decimal"/>
       <w:cols w:space="720"/>
       <w:titlePg/>
       <w:bidi/>
@@ -26446,6 +26397,8 @@
           <w:rFonts w:ascii="B Nazanin" w:hAnsi="B Nazanin" w:cs="B Nazanin"/>
           <w:sz w:val="24"/>
           <w:szCs w:val="24"/>
+          <w:rtl/>
+          <w:lang w:bidi="fa-IR"/>
         </w:rPr>
         <w:t>۱</w:t>
       </w:r>
@@ -29086,7 +29039,7 @@
 </file>
 
 <file path=word/styles.xml><?xml version="1.0" encoding="utf-8"?>
-<w:styles xmlns:ns1="http://schemas.openxmlformats.org/markup-compatibility/2006" xmlns:w="http://schemas.openxmlformats.org/wordprocessingml/2006/main" ns1:Ignorable="w14">
+<w:styles xmlns:mc="http://schemas.openxmlformats.org/markup-compatibility/2006" xmlns:w="http://schemas.openxmlformats.org/wordprocessingml/2006/main" mc:Ignorable="w14">
   <w:docDefaults>
     <w:rPrDefault>
       <w:rPr>
@@ -40948,8 +40901,8 @@
       <w:tabs>
         <w:tab w:val="left" w:leader="dot" w:pos="8221"/>
       </w:tabs>
+      <w:bidi w:val="1"/>
       <w:jc w:val="right"/>
-      <w:bidi w:val="1"/>
     </w:pPr>
     <w:rPr>
       <w:rFonts w:ascii="Times New Roman" w:hAnsi="Times New Roman" w:cs="B Nazanin"/>
@@ -40970,8 +40923,8 @@
       <w:tabs>
         <w:tab w:val="left" w:leader="dot" w:pos="8221"/>
       </w:tabs>
+      <w:bidi w:val="1"/>
       <w:jc w:val="right"/>
-      <w:bidi w:val="1"/>
     </w:pPr>
     <w:rPr>
       <w:rFonts w:ascii="Times New Roman" w:hAnsi="Times New Roman" w:cs="B Nazanin"/>
@@ -40990,8 +40943,8 @@
       <w:tabs>
         <w:tab w:val="left" w:leader="dot" w:pos="8221"/>
       </w:tabs>
+      <w:bidi w:val="1"/>
       <w:jc w:val="right"/>
-      <w:bidi w:val="1"/>
     </w:pPr>
     <w:rPr>
       <w:rFonts w:ascii="Times New Roman" w:hAnsi="Times New Roman" w:cs="B Nazanin"/>
@@ -41010,8 +40963,8 @@
       <w:tabs>
         <w:tab w:val="left" w:leader="dot" w:pos="8221"/>
       </w:tabs>
+      <w:bidi w:val="1"/>
       <w:jc w:val="right"/>
-      <w:bidi w:val="1"/>
     </w:pPr>
     <w:rPr>
       <w:rFonts w:ascii="Times New Roman" w:hAnsi="Times New Roman" w:cs="B Nazanin"/>

</xml_diff>

<commit_message>
fix: strip combining hamza from chapter 4 tables, abstract, and abbreviations
</commit_message>
<xml_diff>
--- a/output/final/thesis_complete_draft_v2.docx
+++ b/output/final/thesis_complete_draft_v2.docx
@@ -397,7 +397,7 @@
           <w:szCs w:val="24"/>
           <w:rtl/>
         </w:rPr>
-        <w:t>پژوهش حاضر با هدف تعیین نقش میانجی‌گر طرحواره‌های ناسازگار اولیه در رابطه بین اضطراب صفتی و رفتارهای مالی پرخطر در معامله‌گران بازارهای مالی طراحی شد. این پژوهش از نظر هدف کاربردی و از نظر روش توصیفی-همبستگی از نوع مدل‌سازی معادلات ساختاری است. جامعهٔ آماری پژوهش را کلیهٔ معامله‌گران حقیقی فارسی‌زبان بالای ۱۸ سال با حداقل شش ماه سابقهٔ معامله تشکیل می‌دهند و نمونه‌گیری به روش غیرتصادفی در دسترس به همراه روش گلوله‌برفی انجام می‌شود؛ حجم نمونهٔ هدف بر اساس قواعد تجربی مدل‌یابی معادلات ساختاری ۲۰۰ نفر در نظر گرفته شد. ابزارهای پژوهش شامل فرم اضطراب صفتی پرسشنامهٔ حالت-صفت اسپیلبرگر (۲۰ گویه)، پرسشنامهٔ طرحواره‌های ناسازگار اولیهٔ یانگ ــ فرم کوتاه (۷۵ گویه) و مقیاس تحمل ریسک مالی گرابل و لایتون (۱۳ سؤال) است. برای تحلیل داده‌ها از آمار توصیفی، ضریب همبستگی پیرسون، مدل‌سازی معادلات ساختاری با شاخص‌های برازش و تحلیل میانجی‌گری با ماکروی PROCESS استفاده خواهد شد. یافته‌های تجربی نهایی پس از تحلیل داده‌های واقعی در نسخه نهایی پایان‌نامه گزارش خواهد شد.</w:t>
+        <w:t>پژوهش حاضر با هدف تعیین نقش میانجی‌گر طرحواره‌های ناسازگار اولیه در رابطه بین اضطراب صفتی و رفتارهای مالی پرخطر در معامله‌گران بازارهای مالی طراحی شد. این پژوهش از نظر هدف کاربردی و از نظر روش توصیفی-همبستگی از نوع مدل‌سازی معادلات ساختاری است. جامعه آماری پژوهش را کلیه معامله‌گران حقیقی فارسی‌زبان بالای ۱۸ سال با حداقل شش ماه سابقه معامله تشکیل می‌دهند و نمونه‌گیری به روش غیرتصادفی در دسترس به همراه روش گلوله‌برفی انجام می‌شود؛ حجم نمونه هدف بر اساس قواعد تجربی مدل‌یابی معادلات ساختاری ۲۰۰ نفر در نظر گرفته شد. ابزارهای پژوهش شامل فرم اضطراب صفتی پرسشنامه حالت-صفت اسپیلبرگر (۲۰ گویه)، پرسشنامه طرحواره‌های ناسازگار اولیه یانگ ــ فرم کوتاه (۷۵ گویه) و مقیاس تحمل ریسک مالی گرابل و لایتون (۱۳ سؤال) است. برای تحلیل داده‌ها از آمار توصیفی، ضریب همبستگی پیرسون، مدل‌سازی معادلات ساختاری با شاخص‌های برازش و تحلیل میانجی‌گری با ماکروی PROCESS استفاده خواهد شد. یافته‌های تجربی نهایی پس از تحلیل داده‌های واقعی در نسخه نهایی پایان‌نامه گزارش خواهد شد.</w:t>
       </w:r>
     </w:p>
     <w:p>
@@ -2367,7 +2367,7 @@
                 <w:szCs w:val="24"/>
                 <w:rtl/>
               </w:rPr>
-              <w:t>فرم اضطراب صفتی پرسشنامهٔ حالت-صفت اسپیلبرگر</w:t>
+              <w:t>فرم اضطراب صفتی پرسشنامه حالت-صفت اسپیلبرگر</w:t>
             </w:r>
           </w:p>
         </w:tc>
@@ -2409,7 +2409,7 @@
                 <w:szCs w:val="24"/>
                 <w:rtl/>
               </w:rPr>
-              <w:t>پرسشنامهٔ طرحوارهٔ یانگ ــ فرم کوتاه</w:t>
+              <w:t>پرسشنامه طرحواره یانگ ــ فرم کوتاه</w:t>
             </w:r>
           </w:p>
         </w:tc>
@@ -2703,7 +2703,7 @@
                 <w:szCs w:val="24"/>
                 <w:rtl/>
               </w:rPr>
-              <w:t>ریشهٔ میانگین مربعات خطای تقریب</w:t>
+              <w:t>ریشه میانگین مربعات خطای تقریب</w:t>
             </w:r>
           </w:p>
         </w:tc>
@@ -2745,7 +2745,7 @@
                 <w:szCs w:val="24"/>
                 <w:rtl/>
               </w:rPr>
-              <w:t>ریشهٔ میانگین مربعات باقی‌ماندهٔ استانداردشده</w:t>
+              <w:t>ریشه میانگین مربعات باقی‌مانده استانداردشده</w:t>
             </w:r>
           </w:p>
         </w:tc>
@@ -2829,7 +2829,7 @@
                 <w:szCs w:val="24"/>
                 <w:rtl/>
               </w:rPr>
-              <w:t>فاصلهٔ اطمینان</w:t>
+              <w:t>فاصله اطمینان</w:t>
             </w:r>
           </w:p>
         </w:tc>
@@ -2997,7 +2997,7 @@
                 <w:szCs w:val="24"/>
                 <w:rtl/>
               </w:rPr>
-              <w:t>آمارهٔ خی‌دو</w:t>
+              <w:t>آماره خی‌دو</w:t>
             </w:r>
           </w:p>
         </w:tc>
@@ -14293,7 +14293,7 @@
                 <w:sz w:val="22"/>
                 <w:rtl/>
               </w:rPr>
-              <w:t>نمونهٔ نهایی معتبر</w:t>
+              <w:t>نمونه نهایی معتبر</w:t>
             </w:r>
           </w:p>
         </w:tc>
@@ -17439,7 +17439,7 @@
                 <w:sz w:val="22"/>
                 <w:rtl/>
               </w:rPr>
-              <w:t>تعداد معاملات ۶ ماههٔ اخیر</w:t>
+              <w:t>تعداد معاملات ۶ ماهه اخیر</w:t>
             </w:r>
           </w:p>
         </w:tc>
@@ -17525,7 +17525,7 @@
                 <w:sz w:val="22"/>
                 <w:rtl/>
               </w:rPr>
-              <w:t>تعداد معاملات ۶ ماههٔ اخیر</w:t>
+              <w:t>تعداد معاملات ۶ ماهه اخیر</w:t>
             </w:r>
           </w:p>
         </w:tc>
@@ -17611,7 +17611,7 @@
                 <w:sz w:val="22"/>
                 <w:rtl/>
               </w:rPr>
-              <w:t>تعداد معاملات ۶ ماههٔ اخیر</w:t>
+              <w:t>تعداد معاملات ۶ ماهه اخیر</w:t>
             </w:r>
           </w:p>
         </w:tc>
@@ -17697,7 +17697,7 @@
                 <w:sz w:val="22"/>
                 <w:rtl/>
               </w:rPr>
-              <w:t>سرمایهٔ تقریبی</w:t>
+              <w:t>سرمایه تقریبی</w:t>
             </w:r>
           </w:p>
         </w:tc>
@@ -17783,7 +17783,7 @@
                 <w:sz w:val="22"/>
                 <w:rtl/>
               </w:rPr>
-              <w:t>سرمایهٔ تقریبی</w:t>
+              <w:t>سرمایه تقریبی</w:t>
             </w:r>
           </w:p>
         </w:tc>
@@ -17869,7 +17869,7 @@
                 <w:sz w:val="22"/>
                 <w:rtl/>
               </w:rPr>
-              <w:t>سرمایهٔ تقریبی</w:t>
+              <w:t>سرمایه تقریبی</w:t>
             </w:r>
           </w:p>
         </w:tc>
@@ -17955,7 +17955,7 @@
                 <w:sz w:val="22"/>
                 <w:rtl/>
               </w:rPr>
-              <w:t>سرمایهٔ تقریبی</w:t>
+              <w:t>سرمایه تقریبی</w:t>
             </w:r>
           </w:p>
         </w:tc>
@@ -18041,7 +18041,7 @@
                 <w:sz w:val="22"/>
                 <w:rtl/>
               </w:rPr>
-              <w:t>سرمایهٔ تقریبی</w:t>
+              <w:t>سرمایه تقریبی</w:t>
             </w:r>
           </w:p>
         </w:tc>
@@ -18127,7 +18127,7 @@
                 <w:sz w:val="22"/>
                 <w:rtl/>
               </w:rPr>
-              <w:t>سرمایهٔ تقریبی</w:t>
+              <w:t>سرمایه تقریبی</w:t>
             </w:r>
           </w:p>
         </w:tc>
@@ -18544,7 +18544,7 @@
                 <w:sz w:val="22"/>
                 <w:rtl/>
               </w:rPr>
-              <w:t>دامنهٔ نظری</w:t>
+              <w:t>دامنه نظری</w:t>
             </w:r>
           </w:p>
         </w:tc>
@@ -18568,7 +18568,7 @@
                 <w:sz w:val="22"/>
                 <w:rtl/>
               </w:rPr>
-              <w:t>دامنهٔ مشاهده‌شده</w:t>
+              <w:t>دامنه مشاهده‌شده</w:t>
             </w:r>
           </w:p>
         </w:tc>
@@ -18782,7 +18782,7 @@
                 <w:sz w:val="22"/>
                 <w:rtl/>
               </w:rPr>
-              <w:t>طرحواره‌های ناسازگار اولیه (نمرهٔ کل)</w:t>
+              <w:t>طرحواره‌های ناسازگار اولیه (نمره کل)</w:t>
             </w:r>
           </w:p>
         </w:tc>
@@ -19474,7 +19474,7 @@
                 <w:sz w:val="22"/>
                 <w:rtl/>
               </w:rPr>
-              <w:t>فرم کوتاه یانگ (نمرهٔ کل)</w:t>
+              <w:t>فرم کوتاه یانگ (نمره کل)</w:t>
             </w:r>
           </w:p>
         </w:tc>
@@ -21718,7 +21718,7 @@
                 <w:sz w:val="22"/>
                 <w:rtl/>
               </w:rPr>
-              <w:t>فاصلهٔ اطمینان ۹۵٪</w:t>
+              <w:t>فاصله اطمینان ۹۵٪</w:t>
             </w:r>
           </w:p>
         </w:tc>
@@ -23139,7 +23139,7 @@
                 <w:sz w:val="22"/>
                 <w:rtl/>
               </w:rPr>
-              <w:t>درجهٔ آزادی</w:t>
+              <w:t>درجه آزادی</w:t>
             </w:r>
           </w:p>
         </w:tc>
@@ -23750,7 +23750,7 @@
                 <w:sz w:val="22"/>
                 <w:rtl/>
               </w:rPr>
-              <w:t>فرضیهٔ اول (اصلی): میانجی‌گری طرحواره‌ها</w:t>
+              <w:t>فرضیه اول (اصلی): میانجی‌گری طرحواره‌ها</w:t>
             </w:r>
           </w:p>
         </w:tc>
@@ -23815,7 +23815,7 @@
                 <w:sz w:val="22"/>
                 <w:rtl/>
               </w:rPr>
-              <w:t>فرضیهٔ دوم: رابطهٔ اضطراب با رفتار پرخطر</w:t>
+              <w:t>فرضیه دوم: رابطه اضطراب با رفتار پرخطر</w:t>
             </w:r>
           </w:p>
         </w:tc>
@@ -23880,7 +23880,7 @@
                 <w:sz w:val="22"/>
                 <w:rtl/>
               </w:rPr>
-              <w:t>فرضیهٔ سوم: رابطهٔ اضطراب با طرحواره‌ها</w:t>
+              <w:t>فرضیه سوم: رابطه اضطراب با طرحواره‌ها</w:t>
             </w:r>
           </w:p>
         </w:tc>
@@ -23945,7 +23945,7 @@
                 <w:sz w:val="22"/>
                 <w:rtl/>
               </w:rPr>
-              <w:t>فرضیهٔ چهارم: رابطهٔ طرحواره‌ها با رفتار پرخطر</w:t>
+              <w:t>فرضیه چهارم: رابطه طرحواره‌ها با رفتار پرخطر</w:t>
             </w:r>
           </w:p>
         </w:tc>

</xml_diff>